<commit_message>
Eliminacion de archivos temporales
</commit_message>
<xml_diff>
--- a/TESIS FINAL.docx
+++ b/TESIS FINAL.docx
@@ -13,6 +13,7 @@
           <w:szCs w:val="36"/>
         </w:rPr>
       </w:pPr>
+      <w:bookmarkStart w:id="0" w:name="_Hlk224494485"/>
       <w:r>
         <w:rPr>
           <w:b/>
@@ -1665,6 +1666,7 @@
         <w:t>Ingrid Huidobro</w:t>
       </w:r>
     </w:p>
+    <w:bookmarkEnd w:id="0"/>
     <w:p>
       <w:pPr>
         <w:rPr>
@@ -1690,6 +1692,7 @@
           <w:szCs w:val="36"/>
         </w:rPr>
       </w:pPr>
+      <w:bookmarkStart w:id="1" w:name="_Hlk224494762"/>
       <w:r>
         <w:rPr>
           <w:rFonts w:ascii="Times New Roman" w:hAnsi="Times New Roman" w:cs="Times New Roman"/>
@@ -1756,6 +1759,7 @@
         <w:br w:type="page"/>
       </w:r>
     </w:p>
+    <w:bookmarkEnd w:id="1" w:displacedByCustomXml="next"/>
     <w:sdt>
       <w:sdtPr>
         <w:rPr>
@@ -5078,7 +5082,7 @@
           <w:szCs w:val="28"/>
         </w:rPr>
       </w:pPr>
-      <w:bookmarkStart w:id="0" w:name="_Toc224059851"/>
+      <w:bookmarkStart w:id="2" w:name="_Toc224059851"/>
       <w:r>
         <w:rPr>
           <w:rFonts w:cs="Times New Roman"/>
@@ -5087,7 +5091,7 @@
         <w:lastRenderedPageBreak/>
         <w:t>Datos Informativos</w:t>
       </w:r>
-      <w:bookmarkEnd w:id="0"/>
+      <w:bookmarkEnd w:id="2"/>
     </w:p>
     <w:p>
       <w:pPr>
@@ -5102,11 +5106,11 @@
           <w:szCs w:val="28"/>
         </w:rPr>
       </w:pPr>
-      <w:bookmarkStart w:id="1" w:name="_Toc224059852"/>
+      <w:bookmarkStart w:id="3" w:name="_Toc224059852"/>
       <w:r>
         <w:t>Título de proyecto</w:t>
       </w:r>
-      <w:bookmarkEnd w:id="1"/>
+      <w:bookmarkEnd w:id="3"/>
     </w:p>
     <w:p>
       <w:pPr>
@@ -5118,6 +5122,7 @@
           <w:rFonts w:ascii="Times New Roman" w:hAnsi="Times New Roman" w:cs="Times New Roman"/>
         </w:rPr>
       </w:pPr>
+      <w:bookmarkStart w:id="4" w:name="_Hlk224499781"/>
       <w:r>
         <w:rPr>
           <w:rFonts w:ascii="Times New Roman" w:hAnsi="Times New Roman" w:cs="Times New Roman"/>
@@ -5133,11 +5138,12 @@
           <w:numId w:val="4"/>
         </w:numPr>
       </w:pPr>
-      <w:bookmarkStart w:id="2" w:name="_Toc224059853"/>
+      <w:bookmarkStart w:id="5" w:name="_Toc224059853"/>
+      <w:bookmarkEnd w:id="4"/>
       <w:r>
         <w:t>Personal investigador</w:t>
       </w:r>
-      <w:bookmarkEnd w:id="2"/>
+      <w:bookmarkEnd w:id="5"/>
     </w:p>
     <w:p>
       <w:pPr>
@@ -5405,7 +5411,7 @@
           <w:numId w:val="4"/>
         </w:numPr>
       </w:pPr>
-      <w:bookmarkStart w:id="3" w:name="_Toc224059854"/>
+      <w:bookmarkStart w:id="6" w:name="_Toc224059854"/>
       <w:r>
         <w:t>Proyecto</w:t>
       </w:r>
@@ -5430,7 +5436,7 @@
       <w:r>
         <w:t xml:space="preserve"> el:</w:t>
       </w:r>
-      <w:bookmarkEnd w:id="3"/>
+      <w:bookmarkEnd w:id="6"/>
     </w:p>
     <w:p>
       <w:pPr>
@@ -5465,11 +5471,11 @@
           <w:numId w:val="4"/>
         </w:numPr>
       </w:pPr>
-      <w:bookmarkStart w:id="4" w:name="_bookmark5"/>
-      <w:bookmarkStart w:id="5" w:name="_bookmark6"/>
-      <w:bookmarkStart w:id="6" w:name="_Toc224059855"/>
-      <w:bookmarkEnd w:id="4"/>
-      <w:bookmarkEnd w:id="5"/>
+      <w:bookmarkStart w:id="7" w:name="_bookmark5"/>
+      <w:bookmarkStart w:id="8" w:name="_bookmark6"/>
+      <w:bookmarkStart w:id="9" w:name="_Toc224059855"/>
+      <w:bookmarkEnd w:id="7"/>
+      <w:bookmarkEnd w:id="8"/>
       <w:r>
         <w:t>Duración</w:t>
       </w:r>
@@ -5488,7 +5494,7 @@
       <w:r>
         <w:t xml:space="preserve"> proyecto</w:t>
       </w:r>
-      <w:bookmarkEnd w:id="6"/>
+      <w:bookmarkEnd w:id="9"/>
     </w:p>
     <w:p>
       <w:pPr>
@@ -5515,9 +5521,9 @@
           <w:numId w:val="4"/>
         </w:numPr>
       </w:pPr>
-      <w:bookmarkStart w:id="7" w:name="_bookmark7"/>
-      <w:bookmarkStart w:id="8" w:name="_Toc224059856"/>
-      <w:bookmarkEnd w:id="7"/>
+      <w:bookmarkStart w:id="10" w:name="_bookmark7"/>
+      <w:bookmarkStart w:id="11" w:name="_Toc224059856"/>
+      <w:bookmarkEnd w:id="10"/>
       <w:r>
         <w:t>Fecha</w:t>
       </w:r>
@@ -5533,7 +5539,7 @@
       <w:r>
         <w:t xml:space="preserve"> y fin</w:t>
       </w:r>
-      <w:bookmarkEnd w:id="8"/>
+      <w:bookmarkEnd w:id="11"/>
     </w:p>
     <w:p>
       <w:pPr>
@@ -5553,6 +5559,7 @@
           <w:rFonts w:ascii="Times New Roman" w:hAnsi="Times New Roman" w:cs="Times New Roman"/>
         </w:rPr>
       </w:pPr>
+      <w:bookmarkStart w:id="12" w:name="_Hlk224500037"/>
       <w:r>
         <w:rPr>
           <w:rFonts w:ascii="Times New Roman" w:hAnsi="Times New Roman" w:cs="Times New Roman"/>
@@ -5611,14 +5618,15 @@
         </w:numPr>
         <w:ind w:left="720"/>
       </w:pPr>
-      <w:bookmarkStart w:id="9" w:name="_bookmark8"/>
-      <w:bookmarkStart w:id="10" w:name="_Toc224059857"/>
-      <w:bookmarkEnd w:id="9"/>
+      <w:bookmarkStart w:id="13" w:name="_bookmark8"/>
+      <w:bookmarkStart w:id="14" w:name="_Toc224059857"/>
+      <w:bookmarkEnd w:id="12"/>
+      <w:bookmarkEnd w:id="13"/>
       <w:r>
         <w:lastRenderedPageBreak/>
         <w:t>Introducción</w:t>
       </w:r>
-      <w:bookmarkEnd w:id="10"/>
+      <w:bookmarkEnd w:id="14"/>
     </w:p>
     <w:p>
       <w:pPr>
@@ -5629,6 +5637,7 @@
           <w:rFonts w:ascii="Times New Roman" w:hAnsi="Times New Roman" w:cs="Times New Roman"/>
         </w:rPr>
       </w:pPr>
+      <w:bookmarkStart w:id="15" w:name="_Hlk224500196"/>
       <w:r>
         <w:rPr>
           <w:rFonts w:ascii="Times New Roman" w:hAnsi="Times New Roman" w:cs="Times New Roman"/>
@@ -5748,6 +5757,7 @@
         <w:t>.</w:t>
       </w:r>
     </w:p>
+    <w:bookmarkEnd w:id="15"/>
     <w:p>
       <w:pPr>
         <w:pStyle w:val="Prrafodelista"/>
@@ -5788,7 +5798,7 @@
           <w:szCs w:val="26"/>
         </w:rPr>
       </w:pPr>
-      <w:bookmarkStart w:id="11" w:name="_Toc224059858"/>
+      <w:bookmarkStart w:id="16" w:name="_Toc224059858"/>
       <w:r>
         <w:rPr>
           <w:rFonts w:cs="Times New Roman"/>
@@ -5797,7 +5807,7 @@
         </w:rPr>
         <w:t>Planteamiento de la investigación</w:t>
       </w:r>
-      <w:bookmarkEnd w:id="11"/>
+      <w:bookmarkEnd w:id="16"/>
     </w:p>
     <w:p>
       <w:pPr>
@@ -5811,7 +5821,7 @@
           <w:szCs w:val="24"/>
         </w:rPr>
       </w:pPr>
-      <w:bookmarkStart w:id="12" w:name="_Toc224059859"/>
+      <w:bookmarkStart w:id="17" w:name="_Toc224059859"/>
       <w:r>
         <w:rPr>
           <w:sz w:val="24"/>
@@ -5819,7 +5829,7 @@
         </w:rPr>
         <w:t>Situación problemática</w:t>
       </w:r>
-      <w:bookmarkEnd w:id="12"/>
+      <w:bookmarkEnd w:id="17"/>
     </w:p>
     <w:p>
       <w:pPr>
@@ -5830,6 +5840,7 @@
           <w:rFonts w:ascii="Times New Roman" w:hAnsi="Times New Roman" w:cs="Times New Roman"/>
         </w:rPr>
       </w:pPr>
+      <w:bookmarkStart w:id="18" w:name="_Hlk224500484"/>
       <w:r>
         <w:rPr>
           <w:rFonts w:ascii="Times New Roman" w:hAnsi="Times New Roman" w:cs="Times New Roman"/>
@@ -6287,7 +6298,8 @@
           <w:szCs w:val="24"/>
         </w:rPr>
       </w:pPr>
-      <w:bookmarkStart w:id="13" w:name="_Toc224059860"/>
+      <w:bookmarkStart w:id="19" w:name="_Toc224059860"/>
+      <w:bookmarkEnd w:id="18"/>
       <w:r>
         <w:rPr>
           <w:sz w:val="24"/>
@@ -6295,7 +6307,7 @@
         </w:rPr>
         <w:t>Formulación del problema de investigación</w:t>
       </w:r>
-      <w:bookmarkEnd w:id="13"/>
+      <w:bookmarkEnd w:id="19"/>
     </w:p>
     <w:p>
       <w:pPr>
@@ -6306,6 +6318,7 @@
           <w:rFonts w:ascii="Times New Roman" w:hAnsi="Times New Roman" w:cs="Times New Roman"/>
         </w:rPr>
       </w:pPr>
+      <w:bookmarkStart w:id="20" w:name="_Hlk224500865"/>
       <w:r>
         <w:rPr>
           <w:rFonts w:ascii="Times New Roman" w:hAnsi="Times New Roman" w:cs="Times New Roman"/>
@@ -6325,7 +6338,8 @@
           <w:szCs w:val="24"/>
         </w:rPr>
       </w:pPr>
-      <w:bookmarkStart w:id="14" w:name="_Toc224059861"/>
+      <w:bookmarkStart w:id="21" w:name="_Toc224059861"/>
+      <w:bookmarkEnd w:id="20"/>
       <w:r>
         <w:rPr>
           <w:sz w:val="24"/>
@@ -6333,7 +6347,7 @@
         </w:rPr>
         <w:t>Objetivo general</w:t>
       </w:r>
-      <w:bookmarkEnd w:id="14"/>
+      <w:bookmarkEnd w:id="21"/>
     </w:p>
     <w:p>
       <w:pPr>
@@ -6344,6 +6358,7 @@
           <w:rFonts w:ascii="Times New Roman" w:hAnsi="Times New Roman" w:cs="Times New Roman"/>
         </w:rPr>
       </w:pPr>
+      <w:bookmarkStart w:id="22" w:name="_Hlk224500890"/>
       <w:r>
         <w:rPr>
           <w:rFonts w:ascii="Times New Roman" w:hAnsi="Times New Roman" w:cs="Times New Roman"/>
@@ -6376,7 +6391,8 @@
           <w:szCs w:val="24"/>
         </w:rPr>
       </w:pPr>
-      <w:bookmarkStart w:id="15" w:name="_Toc224059862"/>
+      <w:bookmarkStart w:id="23" w:name="_Toc224059862"/>
+      <w:bookmarkEnd w:id="22"/>
       <w:r>
         <w:rPr>
           <w:sz w:val="24"/>
@@ -6384,7 +6400,7 @@
         </w:rPr>
         <w:t>Objetivos específicos</w:t>
       </w:r>
-      <w:bookmarkEnd w:id="15"/>
+      <w:bookmarkEnd w:id="23"/>
     </w:p>
     <w:p>
       <w:pPr>
@@ -6399,6 +6415,7 @@
           <w:rFonts w:ascii="Times New Roman" w:hAnsi="Times New Roman" w:cs="Times New Roman"/>
         </w:rPr>
       </w:pPr>
+      <w:bookmarkStart w:id="24" w:name="_Hlk224500975"/>
       <w:r>
         <w:rPr>
           <w:rFonts w:ascii="Times New Roman" w:hAnsi="Times New Roman" w:cs="Times New Roman"/>
@@ -6492,6 +6509,7 @@
         <w:t>.</w:t>
       </w:r>
     </w:p>
+    <w:bookmarkEnd w:id="24"/>
     <w:p>
       <w:pPr>
         <w:pStyle w:val="Prrafodelista"/>
@@ -6534,7 +6552,7 @@
           <w:szCs w:val="26"/>
         </w:rPr>
       </w:pPr>
-      <w:bookmarkStart w:id="16" w:name="_Toc224059863"/>
+      <w:bookmarkStart w:id="25" w:name="_Toc224059863"/>
       <w:r>
         <w:rPr>
           <w:rFonts w:cs="Times New Roman"/>
@@ -6543,7 +6561,7 @@
         </w:rPr>
         <w:t>Diseño teórico</w:t>
       </w:r>
-      <w:bookmarkEnd w:id="16"/>
+      <w:bookmarkEnd w:id="25"/>
     </w:p>
     <w:p>
       <w:pPr>
@@ -6553,11 +6571,11 @@
           <w:numId w:val="3"/>
         </w:numPr>
       </w:pPr>
-      <w:bookmarkStart w:id="17" w:name="_Toc224059864"/>
+      <w:bookmarkStart w:id="26" w:name="_Toc224059864"/>
       <w:r>
         <w:t>Antecedentes</w:t>
       </w:r>
-      <w:bookmarkEnd w:id="17"/>
+      <w:bookmarkEnd w:id="26"/>
     </w:p>
     <w:p>
       <w:pPr>
@@ -6568,6 +6586,7 @@
           <w:rFonts w:ascii="Times New Roman" w:hAnsi="Times New Roman" w:cs="Times New Roman"/>
         </w:rPr>
       </w:pPr>
+      <w:bookmarkStart w:id="27" w:name="_Hlk224501082"/>
       <w:r>
         <w:rPr>
           <w:rFonts w:ascii="Times New Roman" w:hAnsi="Times New Roman" w:cs="Times New Roman"/>
@@ -6616,6 +6635,8 @@
           <w:bCs/>
         </w:rPr>
       </w:pPr>
+      <w:bookmarkStart w:id="28" w:name="_Hlk224506419"/>
+      <w:bookmarkEnd w:id="27"/>
       <w:r>
         <w:rPr>
           <w:rFonts w:ascii="Times New Roman" w:hAnsi="Times New Roman" w:cs="Times New Roman"/>
@@ -6634,6 +6655,8 @@
           <w:rFonts w:ascii="Times New Roman" w:hAnsi="Times New Roman" w:cs="Times New Roman"/>
         </w:rPr>
       </w:pPr>
+      <w:bookmarkStart w:id="29" w:name="_Hlk224506473"/>
+      <w:bookmarkEnd w:id="28"/>
       <w:r>
         <w:rPr>
           <w:rFonts w:ascii="Times New Roman" w:hAnsi="Times New Roman" w:cs="Times New Roman"/>
@@ -6694,6 +6717,8 @@
           <w:rFonts w:ascii="Times New Roman" w:hAnsi="Times New Roman" w:cs="Times New Roman"/>
         </w:rPr>
       </w:pPr>
+      <w:bookmarkStart w:id="30" w:name="_Hlk224506514"/>
+      <w:bookmarkEnd w:id="29"/>
       <w:r>
         <w:rPr>
           <w:rFonts w:ascii="Times New Roman" w:hAnsi="Times New Roman" w:cs="Times New Roman"/>
@@ -6748,6 +6773,8 @@
           <w:bCs/>
         </w:rPr>
       </w:pPr>
+      <w:bookmarkStart w:id="31" w:name="_Hlk224506527"/>
+      <w:bookmarkEnd w:id="30"/>
       <w:r>
         <w:rPr>
           <w:rFonts w:ascii="Times New Roman" w:hAnsi="Times New Roman" w:cs="Times New Roman"/>
@@ -6798,6 +6825,8 @@
           <w:rFonts w:ascii="Times New Roman" w:hAnsi="Times New Roman" w:cs="Times New Roman"/>
         </w:rPr>
       </w:pPr>
+      <w:bookmarkStart w:id="32" w:name="_Hlk224506545"/>
+      <w:bookmarkEnd w:id="31"/>
       <w:r>
         <w:rPr>
           <w:rFonts w:ascii="Times New Roman" w:hAnsi="Times New Roman" w:cs="Times New Roman"/>
@@ -6900,6 +6929,8 @@
           <w:bCs/>
         </w:rPr>
       </w:pPr>
+      <w:bookmarkStart w:id="33" w:name="_Hlk224506652"/>
+      <w:bookmarkEnd w:id="32"/>
       <w:r>
         <w:rPr>
           <w:rFonts w:ascii="Times New Roman" w:hAnsi="Times New Roman" w:cs="Times New Roman"/>
@@ -6942,6 +6973,8 @@
           <w:rFonts w:ascii="Times New Roman" w:hAnsi="Times New Roman" w:cs="Times New Roman"/>
         </w:rPr>
       </w:pPr>
+      <w:bookmarkStart w:id="34" w:name="_Hlk224506673"/>
+      <w:bookmarkEnd w:id="33"/>
       <w:r>
         <w:rPr>
           <w:rFonts w:ascii="Times New Roman" w:hAnsi="Times New Roman" w:cs="Times New Roman"/>
@@ -7028,6 +7061,8 @@
           <w:bCs/>
         </w:rPr>
       </w:pPr>
+      <w:bookmarkStart w:id="35" w:name="_Hlk224506792"/>
+      <w:bookmarkEnd w:id="34"/>
       <w:r>
         <w:rPr>
           <w:rFonts w:ascii="Times New Roman" w:hAnsi="Times New Roman" w:cs="Times New Roman"/>
@@ -7070,6 +7105,8 @@
           <w:rFonts w:ascii="Times New Roman" w:hAnsi="Times New Roman" w:cs="Times New Roman"/>
         </w:rPr>
       </w:pPr>
+      <w:bookmarkStart w:id="36" w:name="_Hlk224506801"/>
+      <w:bookmarkEnd w:id="35"/>
       <w:r>
         <w:rPr>
           <w:rFonts w:ascii="Times New Roman" w:hAnsi="Times New Roman" w:cs="Times New Roman"/>
@@ -7128,6 +7165,8 @@
           <w:bCs/>
         </w:rPr>
       </w:pPr>
+      <w:bookmarkStart w:id="37" w:name="_Hlk224506840"/>
+      <w:bookmarkEnd w:id="36"/>
       <w:r>
         <w:rPr>
           <w:rFonts w:ascii="Times New Roman" w:hAnsi="Times New Roman" w:cs="Times New Roman"/>
@@ -7146,6 +7185,8 @@
           <w:rFonts w:ascii="Times New Roman" w:hAnsi="Times New Roman" w:cs="Times New Roman"/>
         </w:rPr>
       </w:pPr>
+      <w:bookmarkStart w:id="38" w:name="_Hlk224506849"/>
+      <w:bookmarkEnd w:id="37"/>
       <w:r>
         <w:rPr>
           <w:rFonts w:ascii="Times New Roman" w:hAnsi="Times New Roman" w:cs="Times New Roman"/>
@@ -7253,6 +7294,8 @@
           <w:bCs/>
         </w:rPr>
       </w:pPr>
+      <w:bookmarkStart w:id="39" w:name="_Hlk224506940"/>
+      <w:bookmarkEnd w:id="38"/>
       <w:r>
         <w:rPr>
           <w:rFonts w:ascii="Times New Roman" w:hAnsi="Times New Roman" w:cs="Times New Roman"/>
@@ -7296,6 +7339,8 @@
           <w:rFonts w:ascii="Times New Roman" w:hAnsi="Times New Roman" w:cs="Times New Roman"/>
         </w:rPr>
       </w:pPr>
+      <w:bookmarkStart w:id="40" w:name="_Hlk224506964"/>
+      <w:bookmarkEnd w:id="39"/>
       <w:r>
         <w:rPr>
           <w:rFonts w:ascii="Times New Roman" w:hAnsi="Times New Roman" w:cs="Times New Roman"/>
@@ -7383,6 +7428,8 @@
           <w:bCs/>
         </w:rPr>
       </w:pPr>
+      <w:bookmarkStart w:id="41" w:name="_Hlk224506982"/>
+      <w:bookmarkEnd w:id="40"/>
       <w:r>
         <w:rPr>
           <w:rFonts w:ascii="Times New Roman" w:hAnsi="Times New Roman" w:cs="Times New Roman"/>
@@ -7425,6 +7472,8 @@
           <w:rFonts w:ascii="Times New Roman" w:hAnsi="Times New Roman" w:cs="Times New Roman"/>
         </w:rPr>
       </w:pPr>
+      <w:bookmarkStart w:id="42" w:name="_Hlk224506992"/>
+      <w:bookmarkEnd w:id="41"/>
       <w:r>
         <w:rPr>
           <w:rFonts w:ascii="Times New Roman" w:hAnsi="Times New Roman" w:cs="Times New Roman"/>
@@ -7506,6 +7555,8 @@
           <w:bCs/>
         </w:rPr>
       </w:pPr>
+      <w:bookmarkStart w:id="43" w:name="_Hlk224507006"/>
+      <w:bookmarkEnd w:id="42"/>
       <w:r>
         <w:rPr>
           <w:rFonts w:ascii="Times New Roman" w:hAnsi="Times New Roman" w:cs="Times New Roman"/>
@@ -7548,6 +7599,8 @@
           <w:rFonts w:ascii="Times New Roman" w:hAnsi="Times New Roman" w:cs="Times New Roman"/>
         </w:rPr>
       </w:pPr>
+      <w:bookmarkStart w:id="44" w:name="_Hlk224507022"/>
+      <w:bookmarkEnd w:id="43"/>
       <w:r>
         <w:rPr>
           <w:rFonts w:ascii="Times New Roman" w:hAnsi="Times New Roman" w:cs="Times New Roman"/>
@@ -7668,6 +7721,8 @@
           <w:bCs/>
         </w:rPr>
       </w:pPr>
+      <w:bookmarkStart w:id="45" w:name="_Hlk224507035"/>
+      <w:bookmarkEnd w:id="44"/>
       <w:r>
         <w:rPr>
           <w:rFonts w:ascii="Times New Roman" w:hAnsi="Times New Roman" w:cs="Times New Roman"/>
@@ -7710,6 +7765,8 @@
           <w:rFonts w:ascii="Times New Roman" w:hAnsi="Times New Roman" w:cs="Times New Roman"/>
         </w:rPr>
       </w:pPr>
+      <w:bookmarkStart w:id="46" w:name="_Hlk224507061"/>
+      <w:bookmarkEnd w:id="45"/>
       <w:r>
         <w:rPr>
           <w:rFonts w:ascii="Times New Roman" w:hAnsi="Times New Roman" w:cs="Times New Roman"/>
@@ -7831,7 +7888,8 @@
           <w:szCs w:val="26"/>
         </w:rPr>
       </w:pPr>
-      <w:bookmarkStart w:id="18" w:name="_Toc224059865"/>
+      <w:bookmarkStart w:id="47" w:name="_Toc224059865"/>
+      <w:bookmarkEnd w:id="46"/>
       <w:r>
         <w:rPr>
           <w:rFonts w:cs="Times New Roman"/>
@@ -7840,7 +7898,7 @@
         </w:rPr>
         <w:t>Bases teóricas</w:t>
       </w:r>
-      <w:bookmarkEnd w:id="18"/>
+      <w:bookmarkEnd w:id="47"/>
     </w:p>
     <w:p>
       <w:pPr>
@@ -7856,7 +7914,7 @@
           <w:szCs w:val="24"/>
         </w:rPr>
       </w:pPr>
-      <w:bookmarkStart w:id="19" w:name="_Toc224059866"/>
+      <w:bookmarkStart w:id="48" w:name="_Toc224059866"/>
       <w:r>
         <w:rPr>
           <w:rFonts w:cs="Times New Roman"/>
@@ -7866,7 +7924,7 @@
         </w:rPr>
         <w:t>Fundamentos de firma digital</w:t>
       </w:r>
-      <w:bookmarkEnd w:id="19"/>
+      <w:bookmarkEnd w:id="48"/>
     </w:p>
     <w:p>
       <w:pPr>
@@ -7877,6 +7935,7 @@
           <w:rFonts w:ascii="Times New Roman" w:hAnsi="Times New Roman" w:cs="Times New Roman"/>
         </w:rPr>
       </w:pPr>
+      <w:bookmarkStart w:id="49" w:name="_Hlk224507661"/>
       <w:r>
         <w:rPr>
           <w:rFonts w:ascii="Times New Roman" w:hAnsi="Times New Roman" w:cs="Times New Roman"/>
@@ -7913,14 +7972,7 @@
         <w:rPr>
           <w:rFonts w:ascii="Times New Roman" w:hAnsi="Times New Roman" w:cs="Times New Roman"/>
         </w:rPr>
-        <w:t xml:space="preserve">En la presente investigación, la firma digital se incorpora como un componente del sistema informático para respaldar los informes generados tras la verificación de la no duplicidad de proyectos de investigación. De esta manera, los resultados emitidos por el sistema cuentan con un mecanismo de validación que garantiza su autenticidad e integridad, fortaleciendo la confianza en el proceso de </w:t>
-      </w:r>
-      <w:r>
-        <w:rPr>
-          <w:rFonts w:ascii="Times New Roman" w:hAnsi="Times New Roman" w:cs="Times New Roman"/>
-        </w:rPr>
-        <w:lastRenderedPageBreak/>
-        <w:t>evaluación y asegurando que los informes no puedan ser modificados sin dejar evidencia.</w:t>
+        <w:t>En la presente investigación, la firma digital se incorpora como un componente del sistema informático para respaldar los informes generados tras la verificación de la no duplicidad de proyectos de investigación. De esta manera, los resultados emitidos por el sistema cuentan con un mecanismo de validación que garantiza su autenticidad e integridad, fortaleciendo la confianza en el proceso de evaluación y asegurando que los informes no puedan ser modificados sin dejar evidencia.</w:t>
       </w:r>
     </w:p>
     <w:p>
@@ -7968,7 +8020,9 @@
           <w:szCs w:val="24"/>
         </w:rPr>
       </w:pPr>
-      <w:bookmarkStart w:id="20" w:name="_Toc224059867"/>
+      <w:bookmarkStart w:id="50" w:name="_Toc224059867"/>
+      <w:bookmarkStart w:id="51" w:name="_Hlk224507548"/>
+      <w:bookmarkEnd w:id="49"/>
       <w:r>
         <w:rPr>
           <w:rFonts w:cs="Times New Roman"/>
@@ -7978,7 +8032,7 @@
         </w:rPr>
         <w:t>Criptografía asimétrica</w:t>
       </w:r>
-      <w:bookmarkEnd w:id="20"/>
+      <w:bookmarkEnd w:id="50"/>
     </w:p>
     <w:p>
       <w:pPr>
@@ -7989,6 +8043,7 @@
           <w:rFonts w:ascii="Times New Roman" w:hAnsi="Times New Roman" w:cs="Times New Roman"/>
         </w:rPr>
       </w:pPr>
+      <w:bookmarkStart w:id="52" w:name="_Hlk224507678"/>
       <w:r>
         <w:rPr>
           <w:rFonts w:ascii="Times New Roman" w:hAnsi="Times New Roman" w:cs="Times New Roman"/>
@@ -8025,14 +8080,7 @@
         <w:rPr>
           <w:rFonts w:ascii="Times New Roman" w:hAnsi="Times New Roman" w:cs="Times New Roman"/>
         </w:rPr>
-        <w:t xml:space="preserve">En el sistema informático propuesto en esta investigación, la criptografía cumple un rol fundamental al permitir la protección de los documentos analizados y de los resultados generados. El uso de funciones criptográficas garantiza que los informes de similitud y las firmas digitales no puedan ser alterados sin ser detectados, </w:t>
-      </w:r>
-      <w:r>
-        <w:rPr>
-          <w:rFonts w:ascii="Times New Roman" w:hAnsi="Times New Roman" w:cs="Times New Roman"/>
-        </w:rPr>
-        <w:lastRenderedPageBreak/>
-        <w:t>reforzando la confiabilidad y seguridad del sistema de verificación de la no duplicidad de proyectos de investigación.</w:t>
+        <w:t>En el sistema informático propuesto en esta investigación, la criptografía cumple un rol fundamental al permitir la protección de los documentos analizados y de los resultados generados. El uso de funciones criptográficas garantiza que los informes de similitud y las firmas digitales no puedan ser alterados sin ser detectados, reforzando la confiabilidad y seguridad del sistema de verificación de la no duplicidad de proyectos de investigación.</w:t>
       </w:r>
     </w:p>
     <w:p>
@@ -8066,7 +8114,9 @@
           <w:szCs w:val="24"/>
         </w:rPr>
       </w:pPr>
-      <w:bookmarkStart w:id="21" w:name="_Toc224059868"/>
+      <w:bookmarkStart w:id="53" w:name="_Toc224059868"/>
+      <w:bookmarkEnd w:id="51"/>
+      <w:bookmarkEnd w:id="52"/>
       <w:r>
         <w:rPr>
           <w:rFonts w:cs="Times New Roman"/>
@@ -8076,7 +8126,7 @@
         </w:rPr>
         <w:t>Originalidad académica</w:t>
       </w:r>
-      <w:bookmarkEnd w:id="21"/>
+      <w:bookmarkEnd w:id="53"/>
     </w:p>
     <w:p>
       <w:pPr>
@@ -8087,6 +8137,7 @@
           <w:rFonts w:ascii="Times New Roman" w:hAnsi="Times New Roman" w:cs="Times New Roman"/>
         </w:rPr>
       </w:pPr>
+      <w:bookmarkStart w:id="54" w:name="_Hlk224507693"/>
       <w:r>
         <w:rPr>
           <w:rFonts w:ascii="Times New Roman" w:hAnsi="Times New Roman" w:cs="Times New Roman"/>
@@ -8125,7 +8176,9 @@
           <w:szCs w:val="24"/>
         </w:rPr>
       </w:pPr>
-      <w:bookmarkStart w:id="22" w:name="_Toc224059869"/>
+      <w:bookmarkStart w:id="55" w:name="_Toc224059869"/>
+      <w:bookmarkStart w:id="56" w:name="_Hlk224507590"/>
+      <w:bookmarkEnd w:id="54"/>
       <w:r>
         <w:rPr>
           <w:rFonts w:cs="Times New Roman"/>
@@ -8135,7 +8188,7 @@
         </w:rPr>
         <w:t>Seguridad de la Información</w:t>
       </w:r>
-      <w:bookmarkEnd w:id="22"/>
+      <w:bookmarkEnd w:id="55"/>
     </w:p>
     <w:p>
       <w:pPr>
@@ -8146,6 +8199,7 @@
           <w:rFonts w:ascii="Times New Roman" w:hAnsi="Times New Roman" w:cs="Times New Roman"/>
         </w:rPr>
       </w:pPr>
+      <w:bookmarkStart w:id="57" w:name="_Hlk224507713"/>
       <w:r>
         <w:rPr>
           <w:rFonts w:ascii="Times New Roman" w:hAnsi="Times New Roman" w:cs="Times New Roman"/>
@@ -8166,7 +8220,6 @@
         <w:rPr>
           <w:rFonts w:ascii="Times New Roman" w:hAnsi="Times New Roman" w:cs="Times New Roman"/>
         </w:rPr>
-        <w:lastRenderedPageBreak/>
         <w:t>En los sistemas informáticos, la seguridad de la información es un aspecto crítico, especialmente cuando se gestionan datos sensibles o estratégicos, como documentos académicos, proyectos de investigación y resultados de evaluación. La falta de medidas de seguridad adecuadas puede comprometer la confiabilidad del sistema y generar riesgos legales, académicos e institucionales.</w:t>
       </w:r>
     </w:p>
@@ -8207,7 +8260,9 @@
           <w:szCs w:val="24"/>
         </w:rPr>
       </w:pPr>
-      <w:bookmarkStart w:id="23" w:name="_Toc224059870"/>
+      <w:bookmarkStart w:id="58" w:name="_Toc224059870"/>
+      <w:bookmarkEnd w:id="56"/>
+      <w:bookmarkEnd w:id="57"/>
       <w:r>
         <w:rPr>
           <w:rFonts w:cs="Times New Roman"/>
@@ -8217,7 +8272,7 @@
         </w:rPr>
         <w:t>Metodología SCRUM</w:t>
       </w:r>
-      <w:bookmarkEnd w:id="23"/>
+      <w:bookmarkEnd w:id="58"/>
     </w:p>
     <w:p>
       <w:pPr>
@@ -8228,6 +8283,7 @@
           <w:rFonts w:ascii="Times New Roman" w:hAnsi="Times New Roman" w:cs="Times New Roman"/>
         </w:rPr>
       </w:pPr>
+      <w:bookmarkStart w:id="59" w:name="_Hlk224507731"/>
       <w:r>
         <w:rPr>
           <w:rFonts w:ascii="Times New Roman" w:hAnsi="Times New Roman" w:cs="Times New Roman"/>
@@ -8310,7 +8366,6 @@
         <w:rPr>
           <w:rFonts w:ascii="Times New Roman" w:hAnsi="Times New Roman" w:cs="Times New Roman"/>
         </w:rPr>
-        <w:lastRenderedPageBreak/>
         <w:t>Gracias a su enfoque adaptable y colaborativo, SCRUM es ampliamente utilizado en proyectos donde los requisitos pueden evolucionar, siendo especialmente adecuado para el desarrollo de sistemas informáticos, ya que permite responder oportunamente a los cambios y asegurar la entrega progresiva de valor al usuario final</w:t>
       </w:r>
       <w:r>
@@ -8335,7 +8390,8 @@
           <w:szCs w:val="24"/>
         </w:rPr>
       </w:pPr>
-      <w:bookmarkStart w:id="24" w:name="_Toc224059871"/>
+      <w:bookmarkStart w:id="60" w:name="_Toc224059871"/>
+      <w:bookmarkEnd w:id="59"/>
       <w:r>
         <w:rPr>
           <w:rFonts w:cs="Times New Roman"/>
@@ -8345,7 +8401,7 @@
         </w:rPr>
         <w:t>Procesamiento de Lenguaje Natural (PLN)</w:t>
       </w:r>
-      <w:bookmarkEnd w:id="24"/>
+      <w:bookmarkEnd w:id="60"/>
     </w:p>
     <w:p>
       <w:pPr>
@@ -8356,6 +8412,7 @@
           <w:rFonts w:ascii="Times New Roman" w:hAnsi="Times New Roman" w:cs="Times New Roman"/>
         </w:rPr>
       </w:pPr>
+      <w:bookmarkStart w:id="61" w:name="_Hlk224507753"/>
       <w:r>
         <w:rPr>
           <w:rFonts w:ascii="Times New Roman" w:hAnsi="Times New Roman" w:cs="Times New Roman"/>
@@ -8416,7 +8473,9 @@
           <w:szCs w:val="24"/>
         </w:rPr>
       </w:pPr>
-      <w:bookmarkStart w:id="25" w:name="_Toc224059872"/>
+      <w:bookmarkStart w:id="62" w:name="_Toc224059872"/>
+      <w:bookmarkStart w:id="63" w:name="_Hlk224507640"/>
+      <w:bookmarkEnd w:id="61"/>
       <w:r>
         <w:rPr>
           <w:rFonts w:cs="Times New Roman"/>
@@ -8424,10 +8483,9 @@
           <w:sz w:val="24"/>
           <w:szCs w:val="24"/>
         </w:rPr>
-        <w:lastRenderedPageBreak/>
         <w:t>Trazabilidad</w:t>
       </w:r>
-      <w:bookmarkEnd w:id="25"/>
+      <w:bookmarkEnd w:id="62"/>
       <w:r>
         <w:rPr>
           <w:rFonts w:cs="Times New Roman"/>
@@ -8437,6 +8495,7 @@
         </w:rPr>
         <w:t xml:space="preserve"> </w:t>
       </w:r>
+      <w:bookmarkEnd w:id="63"/>
     </w:p>
     <w:p>
       <w:pPr>
@@ -8447,6 +8506,7 @@
           <w:rFonts w:ascii="Times New Roman" w:hAnsi="Times New Roman" w:cs="Times New Roman"/>
         </w:rPr>
       </w:pPr>
+      <w:bookmarkStart w:id="64" w:name="_Hlk224507782"/>
       <w:r>
         <w:rPr>
           <w:rFonts w:ascii="Times New Roman" w:hAnsi="Times New Roman" w:cs="Times New Roman"/>
@@ -8501,7 +8561,9 @@
           <w:szCs w:val="24"/>
         </w:rPr>
       </w:pPr>
-      <w:bookmarkStart w:id="26" w:name="_Toc224059873"/>
+      <w:bookmarkStart w:id="65" w:name="_Toc224059873"/>
+      <w:bookmarkStart w:id="66" w:name="_Hlk224507647"/>
+      <w:bookmarkEnd w:id="64"/>
       <w:r>
         <w:rPr>
           <w:rFonts w:cs="Times New Roman"/>
@@ -8511,7 +8573,7 @@
         </w:rPr>
         <w:t>TF-IDF (Frecuencia de Término – Frecuencia Inversa de Documento)</w:t>
       </w:r>
-      <w:bookmarkEnd w:id="26"/>
+      <w:bookmarkEnd w:id="65"/>
       <w:r>
         <w:rPr>
           <w:rFonts w:cs="Times New Roman"/>
@@ -8521,6 +8583,7 @@
         </w:rPr>
         <w:t xml:space="preserve"> </w:t>
       </w:r>
+      <w:bookmarkEnd w:id="66"/>
     </w:p>
     <w:p>
       <w:pPr>
@@ -8531,6 +8594,7 @@
           <w:rFonts w:ascii="Times New Roman" w:hAnsi="Times New Roman" w:cs="Times New Roman"/>
         </w:rPr>
       </w:pPr>
+      <w:bookmarkStart w:id="67" w:name="_Hlk224507827"/>
       <w:r>
         <w:rPr>
           <w:rFonts w:ascii="Times New Roman" w:hAnsi="Times New Roman" w:cs="Times New Roman"/>
@@ -8591,14 +8655,7 @@
         <w:rPr>
           <w:rFonts w:ascii="Times New Roman" w:hAnsi="Times New Roman" w:cs="Times New Roman"/>
         </w:rPr>
-        <w:t xml:space="preserve">) es una técnica ampliamente utilizada en el procesamiento de lenguaje natural y en los sistemas de recuperación de información para determinar la relevancia de un término dentro de un documento, considerando su importancia en relación con un conjunto de </w:t>
-      </w:r>
-      <w:r>
-        <w:rPr>
-          <w:rFonts w:ascii="Times New Roman" w:hAnsi="Times New Roman" w:cs="Times New Roman"/>
-        </w:rPr>
-        <w:lastRenderedPageBreak/>
-        <w:t>documentos. Esta técnica permite identificar qué palabras son significativas en un texto y cuáles no aportan información relevante para el análisis comparativo.</w:t>
+        <w:t>) es una técnica ampliamente utilizada en el procesamiento de lenguaje natural y en los sistemas de recuperación de información para determinar la relevancia de un término dentro de un documento, considerando su importancia en relación con un conjunto de documentos. Esta técnica permite identificar qué palabras son significativas en un texto y cuáles no aportan información relevante para el análisis comparativo.</w:t>
       </w:r>
     </w:p>
     <w:p>
@@ -8639,6 +8696,7 @@
         <w:t>.</w:t>
       </w:r>
     </w:p>
+    <w:bookmarkEnd w:id="67"/>
     <w:p>
       <w:pPr>
         <w:pStyle w:val="Prrafodelista"/>
@@ -8680,7 +8738,7 @@
           <w:szCs w:val="26"/>
         </w:rPr>
       </w:pPr>
-      <w:bookmarkStart w:id="27" w:name="_Toc224059874"/>
+      <w:bookmarkStart w:id="68" w:name="_Toc224059874"/>
       <w:r>
         <w:rPr>
           <w:rFonts w:cs="Times New Roman"/>
@@ -8689,7 +8747,7 @@
         </w:rPr>
         <w:t>Diseño metodológico</w:t>
       </w:r>
-      <w:bookmarkEnd w:id="27"/>
+      <w:bookmarkEnd w:id="68"/>
     </w:p>
     <w:p>
       <w:pPr>
@@ -8700,6 +8758,7 @@
           <w:rFonts w:ascii="Times New Roman" w:hAnsi="Times New Roman" w:cs="Times New Roman"/>
         </w:rPr>
       </w:pPr>
+      <w:bookmarkStart w:id="69" w:name="_Hlk224508582"/>
       <w:r>
         <w:rPr>
           <w:rFonts w:ascii="Times New Roman" w:hAnsi="Times New Roman" w:cs="Times New Roman"/>
@@ -8746,8 +8805,14 @@
         <w:rPr>
           <w:rFonts w:ascii="Times New Roman" w:hAnsi="Times New Roman" w:cs="Times New Roman"/>
         </w:rPr>
+        <w:t xml:space="preserve">El diseño preexperimental se caracteriza por la aplicación de un tratamiento a un solo grupo de estudio, realizando mediciones antes y después de la intervención, sin la presencia de un grupo de control. Este diseño resulta pertinente para la presente </w:t>
+      </w:r>
+      <w:r>
+        <w:rPr>
+          <w:rFonts w:ascii="Times New Roman" w:hAnsi="Times New Roman" w:cs="Times New Roman"/>
+        </w:rPr>
         <w:lastRenderedPageBreak/>
-        <w:t>El diseño preexperimental se caracteriza por la aplicación de un tratamiento a un solo grupo de estudio, realizando mediciones antes y después de la intervención, sin la presencia de un grupo de control. Este diseño resulta pertinente para la presente investigación, debido a que se busca analizar el impacto directo del sistema informático propuesto en un contexto real, utilizando información institucional existente.</w:t>
+        <w:t>investigación, debido a que se busca analizar el impacto directo del sistema informático propuesto en un contexto real, utilizando información institucional existente.</w:t>
       </w:r>
     </w:p>
     <w:p>
@@ -8937,11 +9002,12 @@
           <w:numId w:val="9"/>
         </w:numPr>
       </w:pPr>
-      <w:bookmarkStart w:id="28" w:name="_Toc224059875"/>
+      <w:bookmarkStart w:id="70" w:name="_Toc224059875"/>
+      <w:bookmarkEnd w:id="69"/>
       <w:r>
         <w:t>Tipo de investigación</w:t>
       </w:r>
-      <w:bookmarkEnd w:id="28"/>
+      <w:bookmarkEnd w:id="70"/>
     </w:p>
     <w:p>
       <w:pPr>
@@ -8952,6 +9018,7 @@
           <w:rFonts w:ascii="Times New Roman" w:hAnsi="Times New Roman" w:cs="Times New Roman"/>
         </w:rPr>
       </w:pPr>
+      <w:bookmarkStart w:id="71" w:name="_Hlk224508623"/>
       <w:r>
         <w:rPr>
           <w:rFonts w:ascii="Times New Roman" w:hAnsi="Times New Roman" w:cs="Times New Roman"/>
@@ -8972,20 +9039,10 @@
         <w:rPr>
           <w:rFonts w:ascii="Times New Roman" w:hAnsi="Times New Roman" w:cs="Times New Roman"/>
         </w:rPr>
-        <w:lastRenderedPageBreak/>
         <w:t>Este tipo de investigación se orienta a la aplicación de conocimientos teóricos y tecnológicos para resolver situaciones concretas, lo cual se alinea con los objetivos planteados en el presente estudio.</w:t>
       </w:r>
     </w:p>
-    <w:p>
-      <w:pPr>
-        <w:spacing w:line="480" w:lineRule="auto"/>
-        <w:ind w:left="720" w:firstLine="720"/>
-        <w:jc w:val="both"/>
-        <w:rPr>
-          <w:rFonts w:ascii="Times New Roman" w:hAnsi="Times New Roman" w:cs="Times New Roman"/>
-        </w:rPr>
-      </w:pPr>
-    </w:p>
+    <w:bookmarkEnd w:id="71"/>
     <w:p>
       <w:pPr>
         <w:pStyle w:val="Prrafodelista"/>
@@ -9011,6 +9068,7 @@
           <w:sz w:val="28"/>
           <w:szCs w:val="28"/>
         </w:rPr>
+        <w:lastRenderedPageBreak/>
         <w:t xml:space="preserve">CAPITULO </w:t>
       </w:r>
       <w:r>
@@ -9041,6 +9099,7 @@
           <w:szCs w:val="28"/>
         </w:rPr>
       </w:pPr>
+      <w:bookmarkStart w:id="72" w:name="_Hlk224508678"/>
       <w:r>
         <w:rPr>
           <w:rFonts w:ascii="Times New Roman" w:hAnsi="Times New Roman" w:cs="Times New Roman"/>
@@ -9062,17 +9121,27 @@
           <w:rFonts w:ascii="Times New Roman" w:hAnsi="Times New Roman" w:cs="Times New Roman"/>
         </w:rPr>
       </w:pPr>
-      <w:r>
-        <w:rPr>
-          <w:rFonts w:ascii="Times New Roman" w:hAnsi="Times New Roman" w:cs="Times New Roman"/>
-        </w:rPr>
-        <w:t xml:space="preserve">El </w:t>
-      </w:r>
-      <w:r>
-        <w:rPr>
-          <w:rFonts w:ascii="Times New Roman" w:hAnsi="Times New Roman" w:cs="Times New Roman"/>
-        </w:rPr>
-        <w:t xml:space="preserve">software de no duplicidad de trabajos de investigación mantiene una arquitectura Cliente – Servidor, debido que se maneja diferentes proyectos por cada capa del mismo sistema, se tiene separada la parte de </w:t>
+      <w:bookmarkStart w:id="73" w:name="_Hlk224508690"/>
+      <w:bookmarkEnd w:id="72"/>
+      <w:r>
+        <w:rPr>
+          <w:rFonts w:ascii="Times New Roman" w:hAnsi="Times New Roman" w:cs="Times New Roman"/>
+        </w:rPr>
+        <w:t xml:space="preserve">El software de no duplicidad de trabajos de investigación se desarrolla bajo una arquitectura </w:t>
+      </w:r>
+      <w:r>
+        <w:rPr>
+          <w:rFonts w:ascii="Times New Roman" w:hAnsi="Times New Roman" w:cs="Times New Roman"/>
+          <w:b/>
+          <w:bCs/>
+        </w:rPr>
+        <w:t>Cliente–Servidor</w:t>
+      </w:r>
+      <w:r>
+        <w:rPr>
+          <w:rFonts w:ascii="Times New Roman" w:hAnsi="Times New Roman" w:cs="Times New Roman"/>
+        </w:rPr>
+        <w:t xml:space="preserve">, en la cual el sistema se organiza en diferentes componentes distribuidos por capas. En este enfoque, la aplicación mantiene separadas la capa de </w:t>
       </w:r>
       <w:proofErr w:type="spellStart"/>
       <w:r>
@@ -9086,7 +9155,7 @@
         <w:rPr>
           <w:rFonts w:ascii="Times New Roman" w:hAnsi="Times New Roman" w:cs="Times New Roman"/>
         </w:rPr>
-        <w:t xml:space="preserve"> y la parte </w:t>
+        <w:t xml:space="preserve"> y la capa de </w:t>
       </w:r>
       <w:proofErr w:type="spellStart"/>
       <w:r>
@@ -9100,21 +9169,7 @@
         <w:rPr>
           <w:rFonts w:ascii="Times New Roman" w:hAnsi="Times New Roman" w:cs="Times New Roman"/>
         </w:rPr>
-        <w:t xml:space="preserve">, debido que presenta una ventaja clave, la cual es la separación de responsabilidades, ya que el apartado </w:t>
-      </w:r>
-      <w:proofErr w:type="spellStart"/>
-      <w:r>
-        <w:rPr>
-          <w:rFonts w:ascii="Times New Roman" w:hAnsi="Times New Roman" w:cs="Times New Roman"/>
-        </w:rPr>
-        <w:t>backend</w:t>
-      </w:r>
-      <w:proofErr w:type="spellEnd"/>
-      <w:r>
-        <w:rPr>
-          <w:rFonts w:ascii="Times New Roman" w:hAnsi="Times New Roman" w:cs="Times New Roman"/>
-        </w:rPr>
-        <w:t xml:space="preserve"> se encargara de realizar el análisis asíncrono del trabajo de investigación presentado por el tesista, por lo cual, en el caso que existan un volumen considerable de proyectos puestos para su correspondiente análisis y el proyecto sea monolito, su rendimiento seria fuertemente disminuido. </w:t>
+        <w:t>, cada una implementada como proyectos independientes dentro de la solución.</w:t>
       </w:r>
     </w:p>
     <w:p>
@@ -9127,6 +9182,112 @@
           <w:rFonts w:ascii="Times New Roman" w:hAnsi="Times New Roman" w:cs="Times New Roman"/>
         </w:rPr>
       </w:pPr>
+    </w:p>
+    <w:p>
+      <w:pPr>
+        <w:pStyle w:val="Prrafodelista"/>
+        <w:spacing w:after="0" w:line="276" w:lineRule="auto"/>
+        <w:ind w:left="1440"/>
+        <w:jc w:val="both"/>
+        <w:rPr>
+          <w:rFonts w:ascii="Times New Roman" w:hAnsi="Times New Roman" w:cs="Times New Roman"/>
+        </w:rPr>
+      </w:pPr>
+      <w:r>
+        <w:rPr>
+          <w:rFonts w:ascii="Times New Roman" w:hAnsi="Times New Roman" w:cs="Times New Roman"/>
+        </w:rPr>
+        <w:t xml:space="preserve">Esta separación ofrece una ventaja importante en términos de organización y distribución de responsabilidades, ya que cada componente del sistema cumple una función específica dentro del proceso general. En particular, el </w:t>
+      </w:r>
+      <w:proofErr w:type="spellStart"/>
+      <w:r>
+        <w:rPr>
+          <w:rFonts w:ascii="Times New Roman" w:hAnsi="Times New Roman" w:cs="Times New Roman"/>
+        </w:rPr>
+        <w:t>backend</w:t>
+      </w:r>
+      <w:proofErr w:type="spellEnd"/>
+      <w:r>
+        <w:rPr>
+          <w:rFonts w:ascii="Times New Roman" w:hAnsi="Times New Roman" w:cs="Times New Roman"/>
+        </w:rPr>
+        <w:t xml:space="preserve"> es el encargado de gestionar la lógica del sistema y realizar el análisis asíncrono de los trabajos de investigación enviados por los tesistas.</w:t>
+      </w:r>
+    </w:p>
+    <w:p>
+      <w:pPr>
+        <w:pStyle w:val="Prrafodelista"/>
+        <w:spacing w:after="0" w:line="276" w:lineRule="auto"/>
+        <w:ind w:left="1440"/>
+        <w:jc w:val="both"/>
+        <w:rPr>
+          <w:rFonts w:ascii="Times New Roman" w:hAnsi="Times New Roman" w:cs="Times New Roman"/>
+        </w:rPr>
+      </w:pPr>
+    </w:p>
+    <w:p>
+      <w:pPr>
+        <w:pStyle w:val="Prrafodelista"/>
+        <w:spacing w:after="0" w:line="276" w:lineRule="auto"/>
+        <w:ind w:left="1440"/>
+        <w:jc w:val="both"/>
+        <w:rPr>
+          <w:rFonts w:ascii="Times New Roman" w:hAnsi="Times New Roman" w:cs="Times New Roman"/>
+        </w:rPr>
+      </w:pPr>
+      <w:r>
+        <w:rPr>
+          <w:rFonts w:ascii="Times New Roman" w:hAnsi="Times New Roman" w:cs="Times New Roman"/>
+        </w:rPr>
+        <w:t xml:space="preserve">Este enfoque resulta especialmente adecuado considerando que el sistema puede recibir múltiples proyectos para su evaluación en periodos similares. En un escenario donde el sistema se </w:t>
+      </w:r>
+      <w:r>
+        <w:rPr>
+          <w:rFonts w:ascii="Times New Roman" w:hAnsi="Times New Roman" w:cs="Times New Roman"/>
+        </w:rPr>
+        <w:t>implementará</w:t>
+      </w:r>
+      <w:r>
+        <w:rPr>
+          <w:rFonts w:ascii="Times New Roman" w:hAnsi="Times New Roman" w:cs="Times New Roman"/>
+        </w:rPr>
+        <w:t xml:space="preserve"> como una aplicación completamente monolítica, el procesamiento simultáneo de un volumen considerable de trabajos podría afectar negativamente el rendimiento del sistema. Por el contrario, al mantener separadas las responsabilidades entre el </w:t>
+      </w:r>
+      <w:proofErr w:type="spellStart"/>
+      <w:r>
+        <w:rPr>
+          <w:rFonts w:ascii="Times New Roman" w:hAnsi="Times New Roman" w:cs="Times New Roman"/>
+        </w:rPr>
+        <w:t>frontend</w:t>
+      </w:r>
+      <w:proofErr w:type="spellEnd"/>
+      <w:r>
+        <w:rPr>
+          <w:rFonts w:ascii="Times New Roman" w:hAnsi="Times New Roman" w:cs="Times New Roman"/>
+        </w:rPr>
+        <w:t xml:space="preserve"> y el </w:t>
+      </w:r>
+      <w:proofErr w:type="spellStart"/>
+      <w:r>
+        <w:rPr>
+          <w:rFonts w:ascii="Times New Roman" w:hAnsi="Times New Roman" w:cs="Times New Roman"/>
+        </w:rPr>
+        <w:t>backend</w:t>
+      </w:r>
+      <w:proofErr w:type="spellEnd"/>
+      <w:r>
+        <w:rPr>
+          <w:rFonts w:ascii="Times New Roman" w:hAnsi="Times New Roman" w:cs="Times New Roman"/>
+        </w:rPr>
+        <w:t xml:space="preserve">, se facilita una mejor gestión de los recursos y se mejora la capacidad del sistema para manejar múltiples solicitudes de análisis de </w:t>
+      </w:r>
+      <w:r>
+        <w:rPr>
+          <w:rFonts w:ascii="Times New Roman" w:hAnsi="Times New Roman" w:cs="Times New Roman"/>
+        </w:rPr>
+        <w:lastRenderedPageBreak/>
+        <w:t>manera eficiente.</w:t>
+      </w:r>
       <w:r>
         <w:rPr>
           <w:rFonts w:ascii="Times New Roman" w:hAnsi="Times New Roman" w:cs="Times New Roman"/>
@@ -9199,17 +9360,7 @@
         <w:t>Fuente: Elaboración propia</w:t>
       </w:r>
     </w:p>
-    <w:p>
-      <w:pPr>
-        <w:pStyle w:val="Prrafodelista"/>
-        <w:spacing w:after="0" w:line="276" w:lineRule="auto"/>
-        <w:ind w:left="1440"/>
-        <w:jc w:val="both"/>
-        <w:rPr>
-          <w:rFonts w:ascii="Times New Roman" w:hAnsi="Times New Roman" w:cs="Times New Roman"/>
-        </w:rPr>
-      </w:pPr>
-    </w:p>
+    <w:bookmarkEnd w:id="73"/>
     <w:p>
       <w:pPr>
         <w:pStyle w:val="Prrafodelista"/>
@@ -9247,14 +9398,12 @@
           <w:sz w:val="28"/>
           <w:szCs w:val="28"/>
         </w:rPr>
-        <w:lastRenderedPageBreak/>
         <w:t>Backend</w:t>
       </w:r>
       <w:proofErr w:type="spellEnd"/>
     </w:p>
     <w:p>
       <w:pPr>
-        <w:pStyle w:val="Prrafodelista"/>
         <w:spacing w:after="0" w:line="276" w:lineRule="auto"/>
         <w:ind w:left="1440"/>
         <w:jc w:val="both"/>
@@ -9262,11 +9411,12 @@
           <w:rFonts w:ascii="Times New Roman" w:hAnsi="Times New Roman" w:cs="Times New Roman"/>
         </w:rPr>
       </w:pPr>
-      <w:r>
-        <w:rPr>
-          <w:rFonts w:ascii="Times New Roman" w:hAnsi="Times New Roman" w:cs="Times New Roman"/>
-        </w:rPr>
-        <w:t xml:space="preserve">La solución </w:t>
+      <w:bookmarkStart w:id="74" w:name="_Hlk224508818"/>
+      <w:r>
+        <w:rPr>
+          <w:rFonts w:ascii="Times New Roman" w:hAnsi="Times New Roman" w:cs="Times New Roman"/>
+        </w:rPr>
+        <w:t xml:space="preserve">La solución correspondiente al </w:t>
       </w:r>
       <w:proofErr w:type="spellStart"/>
       <w:r>
@@ -9280,7 +9430,7 @@
         <w:rPr>
           <w:rFonts w:ascii="Times New Roman" w:hAnsi="Times New Roman" w:cs="Times New Roman"/>
         </w:rPr>
-        <w:t xml:space="preserve"> se ha realizado con el lenguaje de programación C#, utilizando como </w:t>
+        <w:t xml:space="preserve"> fue desarrollada utilizando el lenguaje de programación C# y el </w:t>
       </w:r>
       <w:proofErr w:type="spellStart"/>
       <w:r>
@@ -9294,7 +9444,101 @@
         <w:rPr>
           <w:rFonts w:ascii="Times New Roman" w:hAnsi="Times New Roman" w:cs="Times New Roman"/>
         </w:rPr>
-        <w:t xml:space="preserve"> .NET 8, manejando una arquitectura cebolla, para la generación de una un API Rest. La solución mencionada esta formado por 3 bibliotecas de clases y un proyecto Web Api: </w:t>
+        <w:t xml:space="preserve"> .NET 8. Para la organización interna del sistema se adoptó una arquitectura tipo Onion </w:t>
+      </w:r>
+      <w:proofErr w:type="spellStart"/>
+      <w:r>
+        <w:rPr>
+          <w:rFonts w:ascii="Times New Roman" w:hAnsi="Times New Roman" w:cs="Times New Roman"/>
+        </w:rPr>
+        <w:t>Architecture</w:t>
+      </w:r>
+      <w:proofErr w:type="spellEnd"/>
+      <w:r>
+        <w:rPr>
+          <w:rFonts w:ascii="Times New Roman" w:hAnsi="Times New Roman" w:cs="Times New Roman"/>
+        </w:rPr>
+        <w:t xml:space="preserve"> (arquitectura cebolla), la cual permite estructurar la aplicación en diferentes capas con responsabilidades bien definidas, favoreciendo la mantenibilidad, escalabilidad y separación de dependencias.</w:t>
+      </w:r>
+    </w:p>
+    <w:p>
+      <w:pPr>
+        <w:spacing w:after="0" w:line="276" w:lineRule="auto"/>
+        <w:ind w:left="720" w:firstLine="720"/>
+        <w:jc w:val="both"/>
+        <w:rPr>
+          <w:rFonts w:ascii="Times New Roman" w:hAnsi="Times New Roman" w:cs="Times New Roman"/>
+        </w:rPr>
+      </w:pPr>
+    </w:p>
+    <w:p>
+      <w:pPr>
+        <w:spacing w:after="0" w:line="276" w:lineRule="auto"/>
+        <w:ind w:left="1440"/>
+        <w:jc w:val="both"/>
+        <w:rPr>
+          <w:rFonts w:ascii="Times New Roman" w:hAnsi="Times New Roman" w:cs="Times New Roman"/>
+        </w:rPr>
+      </w:pPr>
+      <w:r>
+        <w:rPr>
+          <w:rFonts w:ascii="Times New Roman" w:hAnsi="Times New Roman" w:cs="Times New Roman"/>
+        </w:rPr>
+        <w:t xml:space="preserve">Bajo este enfoque, el </w:t>
+      </w:r>
+      <w:proofErr w:type="spellStart"/>
+      <w:r>
+        <w:rPr>
+          <w:rFonts w:ascii="Times New Roman" w:hAnsi="Times New Roman" w:cs="Times New Roman"/>
+        </w:rPr>
+        <w:t>backend</w:t>
+      </w:r>
+      <w:proofErr w:type="spellEnd"/>
+      <w:r>
+        <w:rPr>
+          <w:rFonts w:ascii="Times New Roman" w:hAnsi="Times New Roman" w:cs="Times New Roman"/>
+        </w:rPr>
+        <w:t xml:space="preserve"> se implementa mediante una API REST, encargada de exponer los diferentes </w:t>
+      </w:r>
+      <w:proofErr w:type="spellStart"/>
+      <w:r>
+        <w:rPr>
+          <w:rFonts w:ascii="Times New Roman" w:hAnsi="Times New Roman" w:cs="Times New Roman"/>
+        </w:rPr>
+        <w:t>endpoints</w:t>
+      </w:r>
+      <w:proofErr w:type="spellEnd"/>
+      <w:r>
+        <w:rPr>
+          <w:rFonts w:ascii="Times New Roman" w:hAnsi="Times New Roman" w:cs="Times New Roman"/>
+        </w:rPr>
+        <w:t xml:space="preserve"> que permiten la comunicación entre el sistema y la capa de presentación.</w:t>
+      </w:r>
+    </w:p>
+    <w:p>
+      <w:pPr>
+        <w:spacing w:after="0" w:line="276" w:lineRule="auto"/>
+        <w:ind w:left="720" w:firstLine="720"/>
+        <w:jc w:val="both"/>
+        <w:rPr>
+          <w:rFonts w:ascii="Times New Roman" w:hAnsi="Times New Roman" w:cs="Times New Roman"/>
+        </w:rPr>
+      </w:pPr>
+    </w:p>
+    <w:p>
+      <w:pPr>
+        <w:spacing w:after="0" w:line="276" w:lineRule="auto"/>
+        <w:ind w:left="1440"/>
+        <w:jc w:val="both"/>
+        <w:rPr>
+          <w:rFonts w:ascii="Times New Roman" w:hAnsi="Times New Roman" w:cs="Times New Roman"/>
+        </w:rPr>
+      </w:pPr>
+      <w:r>
+        <w:rPr>
+          <w:rFonts w:ascii="Times New Roman" w:hAnsi="Times New Roman" w:cs="Times New Roman"/>
+        </w:rPr>
+        <w:t>La solución se encuentra estructurada en cuatro proyectos principales, compuestos por un proyecto Web API y tres bibliotecas de clases, cada una con responsabilidades específicas dentro de la arquitectura:</w:t>
       </w:r>
     </w:p>
     <w:p>
@@ -9305,6 +9549,7 @@
           <w:numId w:val="5"/>
         </w:numPr>
         <w:spacing w:after="0" w:line="276" w:lineRule="auto"/>
+        <w:ind w:left="2250"/>
         <w:jc w:val="both"/>
         <w:rPr>
           <w:rFonts w:ascii="Times New Roman" w:hAnsi="Times New Roman" w:cs="Times New Roman"/>
@@ -9314,8 +9559,6 @@
       <w:r>
         <w:rPr>
           <w:rFonts w:ascii="Times New Roman" w:hAnsi="Times New Roman" w:cs="Times New Roman"/>
-          <w:b/>
-          <w:bCs/>
         </w:rPr>
         <w:t>Karify.Api</w:t>
       </w:r>
@@ -9323,51 +9566,33 @@
       <w:r>
         <w:rPr>
           <w:rFonts w:ascii="Times New Roman" w:hAnsi="Times New Roman" w:cs="Times New Roman"/>
-          <w:b/>
-          <w:bCs/>
-        </w:rPr>
-        <w:t>:</w:t>
-      </w:r>
-      <w:r>
-        <w:rPr>
-          <w:rFonts w:ascii="Times New Roman" w:hAnsi="Times New Roman" w:cs="Times New Roman"/>
-        </w:rPr>
-        <w:t xml:space="preserve"> Api </w:t>
+        </w:rPr>
+        <w:t xml:space="preserve">: Proyecto Web API encargado de exponer los </w:t>
       </w:r>
       <w:proofErr w:type="spellStart"/>
       <w:r>
         <w:rPr>
           <w:rFonts w:ascii="Times New Roman" w:hAnsi="Times New Roman" w:cs="Times New Roman"/>
         </w:rPr>
-        <w:t>rest</w:t>
+        <w:t>endpoints</w:t>
       </w:r>
       <w:proofErr w:type="spellEnd"/>
       <w:r>
         <w:rPr>
           <w:rFonts w:ascii="Times New Roman" w:hAnsi="Times New Roman" w:cs="Times New Roman"/>
         </w:rPr>
-        <w:t xml:space="preserve"> encargada</w:t>
-      </w:r>
-      <w:r>
-        <w:rPr>
-          <w:rFonts w:ascii="Times New Roman" w:hAnsi="Times New Roman" w:cs="Times New Roman"/>
-        </w:rPr>
-        <w:t xml:space="preserve"> de exponer </w:t>
-      </w:r>
-      <w:proofErr w:type="spellStart"/>
-      <w:r>
-        <w:rPr>
-          <w:rFonts w:ascii="Times New Roman" w:hAnsi="Times New Roman" w:cs="Times New Roman"/>
-        </w:rPr>
-        <w:t>endpoints</w:t>
-      </w:r>
-      <w:proofErr w:type="spellEnd"/>
-      <w:r>
-        <w:rPr>
-          <w:rFonts w:ascii="Times New Roman" w:hAnsi="Times New Roman" w:cs="Times New Roman"/>
-        </w:rPr>
-        <w:t xml:space="preserve"> de negocio. </w:t>
-      </w:r>
+        <w:t xml:space="preserve"> que permiten acceder a las funcionalidades del sistema y gestionar la comunicación con los clientes que consumen la API.</w:t>
+      </w:r>
+    </w:p>
+    <w:p>
+      <w:pPr>
+        <w:spacing w:after="0" w:line="276" w:lineRule="auto"/>
+        <w:ind w:left="2250" w:firstLine="720"/>
+        <w:jc w:val="both"/>
+        <w:rPr>
+          <w:rFonts w:ascii="Times New Roman" w:hAnsi="Times New Roman" w:cs="Times New Roman"/>
+        </w:rPr>
+      </w:pPr>
     </w:p>
     <w:p>
       <w:pPr>
@@ -9377,6 +9602,7 @@
           <w:numId w:val="5"/>
         </w:numPr>
         <w:spacing w:after="0" w:line="276" w:lineRule="auto"/>
+        <w:ind w:left="2250"/>
         <w:jc w:val="both"/>
         <w:rPr>
           <w:rFonts w:ascii="Times New Roman" w:hAnsi="Times New Roman" w:cs="Times New Roman"/>
@@ -9386,26 +9612,27 @@
       <w:r>
         <w:rPr>
           <w:rFonts w:ascii="Times New Roman" w:hAnsi="Times New Roman" w:cs="Times New Roman"/>
-          <w:b/>
-          <w:bCs/>
-        </w:rPr>
+        </w:rPr>
+        <w:lastRenderedPageBreak/>
         <w:t>Karify.Application</w:t>
       </w:r>
       <w:proofErr w:type="spellEnd"/>
       <w:r>
         <w:rPr>
           <w:rFonts w:ascii="Times New Roman" w:hAnsi="Times New Roman" w:cs="Times New Roman"/>
-          <w:b/>
-          <w:bCs/>
-        </w:rPr>
-        <w:t>:</w:t>
-      </w:r>
-      <w:r>
-        <w:rPr>
-          <w:rFonts w:ascii="Times New Roman" w:hAnsi="Times New Roman" w:cs="Times New Roman"/>
-        </w:rPr>
-        <w:t xml:space="preserve"> Biblioteca de clases para la generación de clases por funcionalidad, para mantener las buenas prácticas de responsabilidad única.</w:t>
-      </w:r>
+        </w:rPr>
+        <w:t>: Biblioteca de clases que contiene la lógica de aplicación del sistema. En esta capa se organizan las funcionalidades por módulos, siguiendo el principio de **responsabilidad única**, con el objetivo de mantener un código estructurado y fácilmente mantenible.</w:t>
+      </w:r>
+    </w:p>
+    <w:p>
+      <w:pPr>
+        <w:spacing w:after="0" w:line="276" w:lineRule="auto"/>
+        <w:ind w:left="2250" w:firstLine="720"/>
+        <w:jc w:val="both"/>
+        <w:rPr>
+          <w:rFonts w:ascii="Times New Roman" w:hAnsi="Times New Roman" w:cs="Times New Roman"/>
+        </w:rPr>
+      </w:pPr>
     </w:p>
     <w:p>
       <w:pPr>
@@ -9415,19 +9642,16 @@
           <w:numId w:val="5"/>
         </w:numPr>
         <w:spacing w:after="0" w:line="276" w:lineRule="auto"/>
-        <w:jc w:val="both"/>
-        <w:rPr>
-          <w:rFonts w:ascii="Times New Roman" w:hAnsi="Times New Roman" w:cs="Times New Roman"/>
-          <w:b/>
-          <w:bCs/>
+        <w:ind w:left="2250"/>
+        <w:jc w:val="both"/>
+        <w:rPr>
+          <w:rFonts w:ascii="Times New Roman" w:hAnsi="Times New Roman" w:cs="Times New Roman"/>
         </w:rPr>
       </w:pPr>
       <w:proofErr w:type="spellStart"/>
       <w:r>
         <w:rPr>
           <w:rFonts w:ascii="Times New Roman" w:hAnsi="Times New Roman" w:cs="Times New Roman"/>
-          <w:b/>
-          <w:bCs/>
         </w:rPr>
         <w:t>Karify.Infrastructure</w:t>
       </w:r>
@@ -9435,37 +9659,25 @@
       <w:r>
         <w:rPr>
           <w:rFonts w:ascii="Times New Roman" w:hAnsi="Times New Roman" w:cs="Times New Roman"/>
-          <w:b/>
-          <w:bCs/>
-        </w:rPr>
-        <w:t xml:space="preserve">: </w:t>
-      </w:r>
-      <w:r>
-        <w:rPr>
-          <w:rFonts w:ascii="Times New Roman" w:hAnsi="Times New Roman" w:cs="Times New Roman"/>
-        </w:rPr>
-        <w:t>Biblioteca</w:t>
-      </w:r>
-      <w:r>
-        <w:rPr>
-          <w:rFonts w:ascii="Times New Roman" w:hAnsi="Times New Roman" w:cs="Times New Roman"/>
-          <w:b/>
-          <w:bCs/>
-        </w:rPr>
-        <w:t xml:space="preserve"> </w:t>
-      </w:r>
-      <w:r>
-        <w:rPr>
-          <w:rFonts w:ascii="Times New Roman" w:hAnsi="Times New Roman" w:cs="Times New Roman"/>
-        </w:rPr>
-        <w:t>de clases pa</w:t>
-      </w:r>
-      <w:r>
-        <w:rPr>
-          <w:rFonts w:ascii="Times New Roman" w:hAnsi="Times New Roman" w:cs="Times New Roman"/>
-        </w:rPr>
-        <w:t>ra el manejo de servicios externos.</w:t>
-      </w:r>
+        </w:rPr>
+        <w:t>:</w:t>
+      </w:r>
+      <w:r>
+        <w:rPr>
+          <w:rFonts w:ascii="Times New Roman" w:hAnsi="Times New Roman" w:cs="Times New Roman"/>
+        </w:rPr>
+        <w:t xml:space="preserve"> Biblioteca de clases destinada a la integración con servicios externos requeridos por el sistema, permitiendo abstraer la comunicación con dichos servicios y desacoplarlos de la lógica principal de la aplicación.</w:t>
+      </w:r>
+    </w:p>
+    <w:p>
+      <w:pPr>
+        <w:spacing w:after="0" w:line="276" w:lineRule="auto"/>
+        <w:ind w:left="2250" w:firstLine="720"/>
+        <w:jc w:val="both"/>
+        <w:rPr>
+          <w:rFonts w:ascii="Times New Roman" w:hAnsi="Times New Roman" w:cs="Times New Roman"/>
+        </w:rPr>
+      </w:pPr>
     </w:p>
     <w:p>
       <w:pPr>
@@ -9475,6 +9687,69 @@
           <w:numId w:val="5"/>
         </w:numPr>
         <w:spacing w:after="0" w:line="276" w:lineRule="auto"/>
+        <w:ind w:left="2250"/>
+        <w:jc w:val="both"/>
+        <w:rPr>
+          <w:rFonts w:ascii="Times New Roman" w:hAnsi="Times New Roman" w:cs="Times New Roman"/>
+        </w:rPr>
+      </w:pPr>
+      <w:proofErr w:type="spellStart"/>
+      <w:r>
+        <w:rPr>
+          <w:rFonts w:ascii="Times New Roman" w:hAnsi="Times New Roman" w:cs="Times New Roman"/>
+        </w:rPr>
+        <w:t>Karify.Persistence</w:t>
+      </w:r>
+      <w:proofErr w:type="spellEnd"/>
+      <w:r>
+        <w:rPr>
+          <w:rFonts w:ascii="Times New Roman" w:hAnsi="Times New Roman" w:cs="Times New Roman"/>
+        </w:rPr>
+        <w:t>:</w:t>
+      </w:r>
+      <w:r>
+        <w:rPr>
+          <w:rFonts w:ascii="Times New Roman" w:hAnsi="Times New Roman" w:cs="Times New Roman"/>
+        </w:rPr>
+        <w:t xml:space="preserve"> </w:t>
+      </w:r>
+      <w:r>
+        <w:rPr>
+          <w:rFonts w:ascii="Times New Roman" w:hAnsi="Times New Roman" w:cs="Times New Roman"/>
+        </w:rPr>
+        <w:t>Biblioteca de clases responsable de la interacción con la base de datos, incluyendo la configuración de la conexión y la ejecución de consultas necesarias para la persistencia y recuperación de la información.</w:t>
+      </w:r>
+    </w:p>
+    <w:p>
+      <w:pPr>
+        <w:spacing w:after="0" w:line="276" w:lineRule="auto"/>
+        <w:ind w:left="720" w:firstLine="720"/>
+        <w:jc w:val="both"/>
+        <w:rPr>
+          <w:rFonts w:ascii="Times New Roman" w:hAnsi="Times New Roman" w:cs="Times New Roman"/>
+        </w:rPr>
+      </w:pPr>
+    </w:p>
+    <w:p>
+      <w:pPr>
+        <w:spacing w:after="0" w:line="276" w:lineRule="auto"/>
+        <w:ind w:left="1440"/>
+        <w:jc w:val="both"/>
+        <w:rPr>
+          <w:rFonts w:ascii="Times New Roman" w:hAnsi="Times New Roman" w:cs="Times New Roman"/>
+        </w:rPr>
+      </w:pPr>
+      <w:r>
+        <w:rPr>
+          <w:rFonts w:ascii="Times New Roman" w:hAnsi="Times New Roman" w:cs="Times New Roman"/>
+        </w:rPr>
+        <w:t>Esta estructura permite mantener una clara separación de responsabilidades entre las diferentes capas del sistema, facilitando el mantenimiento del código, la incorporación de nuevas funcionalidades y la adaptación del sistema a futuros requerimientos.</w:t>
+      </w:r>
+    </w:p>
+    <w:p>
+      <w:pPr>
+        <w:spacing w:after="0" w:line="276" w:lineRule="auto"/>
+        <w:ind w:left="720" w:firstLine="720"/>
         <w:jc w:val="both"/>
         <w:rPr>
           <w:rFonts w:ascii="Times New Roman" w:hAnsi="Times New Roman" w:cs="Times New Roman"/>
@@ -9482,54 +9757,12 @@
           <w:bCs/>
         </w:rPr>
       </w:pPr>
-      <w:proofErr w:type="spellStart"/>
-      <w:r>
-        <w:rPr>
-          <w:rFonts w:ascii="Times New Roman" w:hAnsi="Times New Roman" w:cs="Times New Roman"/>
-          <w:b/>
-          <w:bCs/>
-        </w:rPr>
-        <w:t>Karify.Persistence</w:t>
-      </w:r>
-      <w:proofErr w:type="spellEnd"/>
-      <w:r>
-        <w:rPr>
-          <w:rFonts w:ascii="Times New Roman" w:hAnsi="Times New Roman" w:cs="Times New Roman"/>
-          <w:b/>
-          <w:bCs/>
-        </w:rPr>
-        <w:t xml:space="preserve">: </w:t>
-      </w:r>
-      <w:r>
-        <w:rPr>
-          <w:rFonts w:ascii="Times New Roman" w:hAnsi="Times New Roman" w:cs="Times New Roman"/>
-        </w:rPr>
-        <w:t xml:space="preserve">Biblioteca de clases para la conexión con base de datos e invocación de </w:t>
-      </w:r>
-      <w:r>
-        <w:rPr>
-          <w:rFonts w:ascii="Times New Roman" w:hAnsi="Times New Roman" w:cs="Times New Roman"/>
-        </w:rPr>
-        <w:t>consultas.</w:t>
-      </w:r>
-    </w:p>
-    <w:p>
-      <w:pPr>
-        <w:spacing w:after="0" w:line="276" w:lineRule="auto"/>
-        <w:ind w:left="720" w:firstLine="720"/>
-        <w:jc w:val="both"/>
-        <w:rPr>
-          <w:rFonts w:ascii="Times New Roman" w:hAnsi="Times New Roman" w:cs="Times New Roman"/>
-          <w:b/>
-          <w:bCs/>
-        </w:rPr>
-      </w:pPr>
       <w:r>
         <w:rPr>
           <w:noProof/>
         </w:rPr>
         <w:drawing>
-          <wp:inline distT="0" distB="0" distL="0" distR="0" wp14:anchorId="140AB1EE" wp14:editId="4C2B3A73">
+          <wp:inline distT="0" distB="0" distL="0" distR="0" wp14:anchorId="140AB1EE" wp14:editId="1196E463">
             <wp:extent cx="4593590" cy="2635250"/>
             <wp:effectExtent l="0" t="0" r="0" b="0"/>
             <wp:docPr id="270919101" name="Imagen 6"/>
@@ -9578,6 +9811,7 @@
         </w:drawing>
       </w:r>
     </w:p>
+    <w:bookmarkEnd w:id="74"/>
     <w:p>
       <w:pPr>
         <w:rPr>
@@ -9634,17 +9868,12 @@
           <w:rFonts w:ascii="Times New Roman" w:hAnsi="Times New Roman" w:cs="Times New Roman"/>
         </w:rPr>
       </w:pPr>
-      <w:r>
-        <w:rPr>
-          <w:rFonts w:ascii="Times New Roman" w:hAnsi="Times New Roman" w:cs="Times New Roman"/>
-        </w:rPr>
-        <w:t>Se</w:t>
-      </w:r>
-      <w:r>
-        <w:rPr>
-          <w:rFonts w:ascii="Times New Roman" w:hAnsi="Times New Roman" w:cs="Times New Roman"/>
-        </w:rPr>
-        <w:t xml:space="preserve"> presenta un modelo de base de datos relación, utilizando el motor de SQL Server 2022, para el guardado de información tanto del alumno que envían el documento para su revisión, asimismo, se realiza el guardado de información de los docentes a cargo de la revisión de dicho trabajo de investigación. </w:t>
+      <w:bookmarkStart w:id="75" w:name="_Hlk224508868"/>
+      <w:r>
+        <w:rPr>
+          <w:rFonts w:ascii="Times New Roman" w:hAnsi="Times New Roman" w:cs="Times New Roman"/>
+        </w:rPr>
+        <w:t>Para la gestión de la información del sistema se diseñó un modelo de base de datos relacional, implementado utilizando el motor de base de datos SQL Server 2022. Este modelo permite almacenar de manera estructurada la información generada por el sistema, garantizando la integridad y consistencia de los datos.</w:t>
       </w:r>
     </w:p>
     <w:p>
@@ -9657,23 +9886,78 @@
           <w:rFonts w:ascii="Times New Roman" w:hAnsi="Times New Roman" w:cs="Times New Roman"/>
         </w:rPr>
       </w:pPr>
-      <w:r>
-        <w:rPr>
-          <w:rFonts w:ascii="Times New Roman" w:hAnsi="Times New Roman" w:cs="Times New Roman"/>
-        </w:rPr>
-        <w:t xml:space="preserve">Por la parte de gestión administrativa para el aplicativo, se está registrando roles y permisos para cada uno </w:t>
-      </w:r>
-      <w:r>
-        <w:rPr>
-          <w:rFonts w:ascii="Times New Roman" w:hAnsi="Times New Roman" w:cs="Times New Roman"/>
-        </w:rPr>
-        <w:t>de los usuarios</w:t>
-      </w:r>
-      <w:r>
-        <w:rPr>
-          <w:rFonts w:ascii="Times New Roman" w:hAnsi="Times New Roman" w:cs="Times New Roman"/>
-        </w:rPr>
-        <w:t xml:space="preserve">, ya será para profesores, alumnos y gestores administrativos. </w:t>
+    </w:p>
+    <w:p>
+      <w:pPr>
+        <w:pStyle w:val="Prrafodelista"/>
+        <w:spacing w:after="0" w:line="276" w:lineRule="auto"/>
+        <w:ind w:left="1440"/>
+        <w:jc w:val="both"/>
+        <w:rPr>
+          <w:rFonts w:ascii="Times New Roman" w:hAnsi="Times New Roman" w:cs="Times New Roman"/>
+        </w:rPr>
+      </w:pPr>
+      <w:r>
+        <w:rPr>
+          <w:rFonts w:ascii="Times New Roman" w:hAnsi="Times New Roman" w:cs="Times New Roman"/>
+        </w:rPr>
+        <w:t>Dentro de la base de datos se registran los datos correspondientes a los estudiantes que envían sus trabajos de investigación para su respectiva revisión, así como la información de los docentes responsables de evaluar dichos documentos. Esto permite mantener un seguimiento adecuado del proceso de revisión y análisis de los trabajos académicos dentro del sistema.</w:t>
+      </w:r>
+    </w:p>
+    <w:p>
+      <w:pPr>
+        <w:pStyle w:val="Prrafodelista"/>
+        <w:spacing w:after="0" w:line="276" w:lineRule="auto"/>
+        <w:ind w:left="1440"/>
+        <w:jc w:val="both"/>
+        <w:rPr>
+          <w:rFonts w:ascii="Times New Roman" w:hAnsi="Times New Roman" w:cs="Times New Roman"/>
+        </w:rPr>
+      </w:pPr>
+    </w:p>
+    <w:p>
+      <w:pPr>
+        <w:pStyle w:val="Prrafodelista"/>
+        <w:spacing w:after="0" w:line="276" w:lineRule="auto"/>
+        <w:ind w:left="1440"/>
+        <w:jc w:val="both"/>
+        <w:rPr>
+          <w:rFonts w:ascii="Times New Roman" w:hAnsi="Times New Roman" w:cs="Times New Roman"/>
+        </w:rPr>
+      </w:pPr>
+      <w:r>
+        <w:rPr>
+          <w:rFonts w:ascii="Times New Roman" w:hAnsi="Times New Roman" w:cs="Times New Roman"/>
+        </w:rPr>
+        <w:t>Adicionalmente, el sistema contempla un módulo de gestión administrativa, mediante el cual se administran los usuarios que interactúan con la plataforma. En este módulo se gestionan roles y permisos, los cuales determinan el nivel de acceso y las funcionalidades disponibles para cada tipo de usuario del sistema. Entre los principales perfiles definidos se encuentran los docentes, estudiantes y gestores administrativos, permitiendo así un control adecuado sobre las operaciones que cada usuario puede realizar dentro de la aplicación.</w:t>
+      </w:r>
+    </w:p>
+    <w:p>
+      <w:pPr>
+        <w:pStyle w:val="Prrafodelista"/>
+        <w:spacing w:after="0" w:line="276" w:lineRule="auto"/>
+        <w:ind w:left="1440"/>
+        <w:jc w:val="both"/>
+        <w:rPr>
+          <w:rFonts w:ascii="Times New Roman" w:hAnsi="Times New Roman" w:cs="Times New Roman"/>
+        </w:rPr>
+      </w:pPr>
+    </w:p>
+    <w:p>
+      <w:pPr>
+        <w:pStyle w:val="Prrafodelista"/>
+        <w:spacing w:after="0" w:line="276" w:lineRule="auto"/>
+        <w:ind w:left="1440"/>
+        <w:jc w:val="both"/>
+        <w:rPr>
+          <w:rFonts w:ascii="Times New Roman" w:hAnsi="Times New Roman" w:cs="Times New Roman"/>
+        </w:rPr>
+      </w:pPr>
+      <w:r>
+        <w:rPr>
+          <w:rFonts w:ascii="Times New Roman" w:hAnsi="Times New Roman" w:cs="Times New Roman"/>
+        </w:rPr>
+        <w:t>El uso de un modelo relacional facilita la organización de las entidades del sistema y la definición de relaciones entre ellas, permitiendo una gestión eficiente de la información y un acceso estructurado a los datos requeridos por los diferentes componentes de la aplicación.</w:t>
       </w:r>
     </w:p>
     <w:p>
@@ -9695,13 +9979,14 @@
           <w:rFonts w:ascii="Times New Roman" w:hAnsi="Times New Roman" w:cs="Times New Roman"/>
           <w:b/>
           <w:bCs/>
+          <w:noProof/>
           <w:sz w:val="28"/>
           <w:szCs w:val="28"/>
         </w:rPr>
         <w:drawing>
-          <wp:inline distT="0" distB="0" distL="0" distR="0" wp14:anchorId="776B5711" wp14:editId="4EAA364D">
-            <wp:extent cx="5612130" cy="2487930"/>
-            <wp:effectExtent l="0" t="0" r="7620" b="7620"/>
+          <wp:inline distT="0" distB="0" distL="0" distR="0" wp14:anchorId="776B5711" wp14:editId="78809EBB">
+            <wp:extent cx="4735679" cy="2099388"/>
+            <wp:effectExtent l="0" t="0" r="8255" b="0"/>
             <wp:docPr id="670760441" name="Imagen 1"/>
             <wp:cNvGraphicFramePr>
               <a:graphicFrameLocks xmlns:a="http://schemas.openxmlformats.org/drawingml/2006/main" noChangeAspect="1"/>
@@ -9722,7 +10007,7 @@
                   <pic:spPr>
                     <a:xfrm>
                       <a:off x="0" y="0"/>
-                      <a:ext cx="5612130" cy="2487930"/>
+                      <a:ext cx="4743235" cy="2102738"/>
                     </a:xfrm>
                     <a:prstGeom prst="rect">
                       <a:avLst/>
@@ -9775,6 +10060,8 @@
           <w:rFonts w:ascii="Times New Roman" w:hAnsi="Times New Roman" w:cs="Times New Roman"/>
         </w:rPr>
       </w:pPr>
+      <w:bookmarkStart w:id="76" w:name="_Hlk224508958"/>
+      <w:bookmarkEnd w:id="75"/>
       <w:r>
         <w:rPr>
           <w:rFonts w:ascii="Times New Roman" w:hAnsi="Times New Roman" w:cs="Times New Roman"/>
@@ -9793,21 +10080,21 @@
         <w:rPr>
           <w:rFonts w:ascii="Times New Roman" w:hAnsi="Times New Roman" w:cs="Times New Roman"/>
         </w:rPr>
-        <w:t xml:space="preserve"> se esta presentando un proyecto realizado con HTML5 (HTML, CSS y </w:t>
+        <w:t xml:space="preserve">, el sistema se implementó como una aplicación web desarrollada utilizando tecnologías HTML5, incluyendo HTML, CSS y </w:t>
       </w:r>
       <w:proofErr w:type="spellStart"/>
       <w:r>
         <w:rPr>
           <w:rFonts w:ascii="Times New Roman" w:hAnsi="Times New Roman" w:cs="Times New Roman"/>
         </w:rPr>
-        <w:t>Typescript</w:t>
+        <w:t>TypeScript</w:t>
       </w:r>
       <w:proofErr w:type="spellEnd"/>
       <w:r>
         <w:rPr>
           <w:rFonts w:ascii="Times New Roman" w:hAnsi="Times New Roman" w:cs="Times New Roman"/>
         </w:rPr>
-        <w:t xml:space="preserve">) haciendo uso del </w:t>
+        <w:t xml:space="preserve">, junto con el </w:t>
       </w:r>
       <w:proofErr w:type="spellStart"/>
       <w:r>
@@ -9821,35 +10108,14 @@
         <w:rPr>
           <w:rFonts w:ascii="Times New Roman" w:hAnsi="Times New Roman" w:cs="Times New Roman"/>
         </w:rPr>
-        <w:t xml:space="preserve"> de Angular en su versión 22.3.14, el cual ha pasado a un modelo de </w:t>
-      </w:r>
-      <w:proofErr w:type="spellStart"/>
-      <w:r>
-        <w:rPr>
-          <w:rFonts w:ascii="Times New Roman" w:hAnsi="Times New Roman" w:cs="Times New Roman"/>
-        </w:rPr>
-        <w:t>standalone</w:t>
-      </w:r>
-      <w:proofErr w:type="spellEnd"/>
-      <w:r>
-        <w:rPr>
-          <w:rFonts w:ascii="Times New Roman" w:hAnsi="Times New Roman" w:cs="Times New Roman"/>
-        </w:rPr>
-        <w:t xml:space="preserve">, lo cual nos permite la reducción de utilizando de </w:t>
-      </w:r>
-      <w:proofErr w:type="spellStart"/>
-      <w:r>
-        <w:rPr>
-          <w:rFonts w:ascii="Times New Roman" w:hAnsi="Times New Roman" w:cs="Times New Roman"/>
-        </w:rPr>
-        <w:t>nodemodules</w:t>
-      </w:r>
-      <w:proofErr w:type="spellEnd"/>
-      <w:r>
-        <w:rPr>
-          <w:rFonts w:ascii="Times New Roman" w:hAnsi="Times New Roman" w:cs="Times New Roman"/>
-        </w:rPr>
-        <w:t>, reduciendo a lo estrictamente necesario para su utilización por cada componente</w:t>
+        <w:t xml:space="preserve"> Angular en su versión 22.3.14. Esta </w:t>
+      </w:r>
+      <w:r>
+        <w:rPr>
+          <w:rFonts w:ascii="Times New Roman" w:hAnsi="Times New Roman" w:cs="Times New Roman"/>
+        </w:rPr>
+        <w:lastRenderedPageBreak/>
+        <w:t>combinación tecnológica permite la construcción de interfaces dinámicas y responsivas, facilitando la interacción del usuario con el sistema.</w:t>
       </w:r>
     </w:p>
     <w:p>
@@ -9857,6 +10123,118 @@
         <w:pStyle w:val="Prrafodelista"/>
         <w:spacing w:after="0" w:line="276" w:lineRule="auto"/>
         <w:ind w:firstLine="720"/>
+        <w:jc w:val="both"/>
+        <w:rPr>
+          <w:rFonts w:ascii="Times New Roman" w:hAnsi="Times New Roman" w:cs="Times New Roman"/>
+        </w:rPr>
+      </w:pPr>
+    </w:p>
+    <w:p>
+      <w:pPr>
+        <w:pStyle w:val="Prrafodelista"/>
+        <w:spacing w:after="0" w:line="276" w:lineRule="auto"/>
+        <w:ind w:left="1440"/>
+        <w:jc w:val="both"/>
+        <w:rPr>
+          <w:rFonts w:ascii="Times New Roman" w:hAnsi="Times New Roman" w:cs="Times New Roman"/>
+        </w:rPr>
+      </w:pPr>
+      <w:r>
+        <w:rPr>
+          <w:rFonts w:ascii="Times New Roman" w:hAnsi="Times New Roman" w:cs="Times New Roman"/>
+        </w:rPr>
+        <w:t>La aplicación fue desarrollada utilizando el enfoque de componentes s</w:t>
+      </w:r>
+      <w:proofErr w:type="spellStart"/>
+      <w:r>
+        <w:rPr>
+          <w:rFonts w:ascii="Times New Roman" w:hAnsi="Times New Roman" w:cs="Times New Roman"/>
+        </w:rPr>
+        <w:t>tandalone</w:t>
+      </w:r>
+      <w:proofErr w:type="spellEnd"/>
+      <w:r>
+        <w:rPr>
+          <w:rFonts w:ascii="Times New Roman" w:hAnsi="Times New Roman" w:cs="Times New Roman"/>
+        </w:rPr>
+        <w:t xml:space="preserve"> introducido en las versiones recientes de Angular. Este modelo permite que los componentes funcionen de manera independiente sin depender de módulos tradicionales, lo que simplifica la estructura del proyecto y mejora la organización del código.</w:t>
+      </w:r>
+    </w:p>
+    <w:p>
+      <w:pPr>
+        <w:pStyle w:val="Prrafodelista"/>
+        <w:spacing w:after="0" w:line="276" w:lineRule="auto"/>
+        <w:ind w:left="1440" w:firstLine="720"/>
+        <w:jc w:val="both"/>
+        <w:rPr>
+          <w:rFonts w:ascii="Times New Roman" w:hAnsi="Times New Roman" w:cs="Times New Roman"/>
+        </w:rPr>
+      </w:pPr>
+    </w:p>
+    <w:p>
+      <w:pPr>
+        <w:pStyle w:val="Prrafodelista"/>
+        <w:spacing w:after="0" w:line="276" w:lineRule="auto"/>
+        <w:ind w:left="1440"/>
+        <w:jc w:val="both"/>
+        <w:rPr>
+          <w:rFonts w:ascii="Times New Roman" w:hAnsi="Times New Roman" w:cs="Times New Roman"/>
+        </w:rPr>
+      </w:pPr>
+      <w:r>
+        <w:rPr>
+          <w:rFonts w:ascii="Times New Roman" w:hAnsi="Times New Roman" w:cs="Times New Roman"/>
+        </w:rPr>
+        <w:t xml:space="preserve">Gracias a este enfoque, se logra una optimización en la gestión de dependencias, permitiendo que cada componente utilice únicamente los recursos estrictamente necesarios para su funcionamiento. Como resultado, se reduce la complejidad del proyecto y se optimiza el uso de las dependencias dentro del directorio </w:t>
+      </w:r>
+      <w:proofErr w:type="spellStart"/>
+      <w:r>
+        <w:rPr>
+          <w:rFonts w:ascii="Times New Roman" w:hAnsi="Times New Roman" w:cs="Times New Roman"/>
+        </w:rPr>
+        <w:t>node_modules</w:t>
+      </w:r>
+      <w:proofErr w:type="spellEnd"/>
+      <w:r>
+        <w:rPr>
+          <w:rFonts w:ascii="Times New Roman" w:hAnsi="Times New Roman" w:cs="Times New Roman"/>
+        </w:rPr>
+        <w:t>, contribuyendo a una aplicación más ligera y mantenible.</w:t>
+      </w:r>
+    </w:p>
+    <w:p>
+      <w:pPr>
+        <w:pStyle w:val="Prrafodelista"/>
+        <w:spacing w:after="0" w:line="276" w:lineRule="auto"/>
+        <w:ind w:left="1440" w:firstLine="720"/>
+        <w:jc w:val="both"/>
+        <w:rPr>
+          <w:rFonts w:ascii="Times New Roman" w:hAnsi="Times New Roman" w:cs="Times New Roman"/>
+        </w:rPr>
+      </w:pPr>
+    </w:p>
+    <w:p>
+      <w:pPr>
+        <w:pStyle w:val="Prrafodelista"/>
+        <w:spacing w:after="0" w:line="276" w:lineRule="auto"/>
+        <w:ind w:left="1440"/>
+        <w:jc w:val="both"/>
+        <w:rPr>
+          <w:rFonts w:ascii="Times New Roman" w:hAnsi="Times New Roman" w:cs="Times New Roman"/>
+        </w:rPr>
+      </w:pPr>
+      <w:r>
+        <w:rPr>
+          <w:rFonts w:ascii="Times New Roman" w:hAnsi="Times New Roman" w:cs="Times New Roman"/>
+        </w:rPr>
+        <w:t>Este enfoque también facilita la escalabilidad del sistema, permitiendo incorporar nuevas funcionalidades de manera modular sin afectar el funcionamiento de los componentes existentes.</w:t>
+      </w:r>
+    </w:p>
+    <w:p>
+      <w:pPr>
+        <w:pStyle w:val="Prrafodelista"/>
+        <w:spacing w:after="0" w:line="276" w:lineRule="auto"/>
+        <w:ind w:left="1440"/>
         <w:jc w:val="both"/>
         <w:rPr>
           <w:rFonts w:ascii="Times New Roman" w:hAnsi="Times New Roman" w:cs="Times New Roman"/>
@@ -9942,6 +10320,8 @@
           <w:szCs w:val="28"/>
         </w:rPr>
       </w:pPr>
+      <w:bookmarkStart w:id="77" w:name="_Hlk224509011"/>
+      <w:bookmarkEnd w:id="76"/>
       <w:r>
         <w:rPr>
           <w:rFonts w:ascii="Times New Roman" w:hAnsi="Times New Roman" w:cs="Times New Roman"/>
@@ -9950,7 +10330,6 @@
           <w:sz w:val="28"/>
           <w:szCs w:val="28"/>
         </w:rPr>
-        <w:lastRenderedPageBreak/>
         <w:t>Simulación de API UNPRG</w:t>
       </w:r>
     </w:p>
@@ -9964,17 +10343,69 @@
           <w:rFonts w:ascii="Times New Roman" w:hAnsi="Times New Roman" w:cs="Times New Roman"/>
         </w:rPr>
       </w:pPr>
-      <w:r>
-        <w:rPr>
-          <w:rFonts w:ascii="Times New Roman" w:hAnsi="Times New Roman" w:cs="Times New Roman"/>
-        </w:rPr>
-        <w:t xml:space="preserve">Debido a la privacidad del repositorio institucional de la universidad, se ha optado por la generación de una API como simulación para la obtención de los actuales trabajos de investigación almacenados en él, teniendo en cuenta información como: Titulo de proyecto, resumen de proyecto, tesistas, fecha de publicación, facultad </w:t>
-      </w:r>
-      <w:r>
-        <w:rPr>
-          <w:rFonts w:ascii="Times New Roman" w:hAnsi="Times New Roman" w:cs="Times New Roman"/>
-        </w:rPr>
-        <w:t xml:space="preserve">y escuela profesional. </w:t>
+      <w:bookmarkStart w:id="78" w:name="_Hlk224509018"/>
+      <w:bookmarkEnd w:id="77"/>
+      <w:r>
+        <w:rPr>
+          <w:rFonts w:ascii="Times New Roman" w:hAnsi="Times New Roman" w:cs="Times New Roman"/>
+        </w:rPr>
+        <w:t>Debido a las políticas de privacidad del repositorio institucional de la universidad, no fue posible acceder directamente a la base de datos que contiene los trabajos de investigación almacenados en dicha plataforma. Por este motivo, se optó por implementar una API de simulación, cuyo objetivo es replicar el comportamiento de un servicio real encargado de proporcionar la información necesaria para el funcionamiento del sistema.</w:t>
+      </w:r>
+    </w:p>
+    <w:p>
+      <w:pPr>
+        <w:pStyle w:val="Prrafodelista"/>
+        <w:spacing w:after="0" w:line="276" w:lineRule="auto"/>
+        <w:ind w:left="1440"/>
+        <w:jc w:val="both"/>
+        <w:rPr>
+          <w:rFonts w:ascii="Times New Roman" w:hAnsi="Times New Roman" w:cs="Times New Roman"/>
+        </w:rPr>
+      </w:pPr>
+    </w:p>
+    <w:p>
+      <w:pPr>
+        <w:pStyle w:val="Prrafodelista"/>
+        <w:spacing w:after="0" w:line="276" w:lineRule="auto"/>
+        <w:ind w:left="1440"/>
+        <w:jc w:val="both"/>
+        <w:rPr>
+          <w:rFonts w:ascii="Times New Roman" w:hAnsi="Times New Roman" w:cs="Times New Roman"/>
+        </w:rPr>
+      </w:pPr>
+      <w:r>
+        <w:rPr>
+          <w:rFonts w:ascii="Times New Roman" w:hAnsi="Times New Roman" w:cs="Times New Roman"/>
+        </w:rPr>
+        <w:t>Esta API permite obtener información relevante de los trabajos de investigación registrados en el repositorio institucional, considerando datos como el título del proyecto, el resumen del trabajo, los tesistas involucrados, la fecha de publicación, la facultad y la escuela profesional a la que pertenece el proyecto.</w:t>
+      </w:r>
+    </w:p>
+    <w:p>
+      <w:pPr>
+        <w:pStyle w:val="Prrafodelista"/>
+        <w:spacing w:after="0" w:line="276" w:lineRule="auto"/>
+        <w:ind w:left="1440"/>
+        <w:jc w:val="both"/>
+        <w:rPr>
+          <w:rFonts w:ascii="Times New Roman" w:hAnsi="Times New Roman" w:cs="Times New Roman"/>
+        </w:rPr>
+      </w:pPr>
+    </w:p>
+    <w:p>
+      <w:pPr>
+        <w:pStyle w:val="Prrafodelista"/>
+        <w:spacing w:after="0" w:line="276" w:lineRule="auto"/>
+        <w:ind w:left="1440"/>
+        <w:jc w:val="both"/>
+        <w:rPr>
+          <w:rFonts w:ascii="Times New Roman" w:hAnsi="Times New Roman" w:cs="Times New Roman"/>
+        </w:rPr>
+      </w:pPr>
+      <w:r>
+        <w:rPr>
+          <w:rFonts w:ascii="Times New Roman" w:hAnsi="Times New Roman" w:cs="Times New Roman"/>
+        </w:rPr>
+        <w:t>La utilización de esta simulación permite reproducir el flujo de funcionamiento que tendría el sistema en un entorno real, facilitando así el desarrollo, la integración y la validación de las funcionalidades del aplicativo sin comprometer la seguridad ni la confidencialidad de la información almacenada en el repositorio institucional.</w:t>
       </w:r>
     </w:p>
     <w:p>
@@ -9994,6 +10425,8 @@
           <w:szCs w:val="28"/>
         </w:rPr>
       </w:pPr>
+      <w:bookmarkStart w:id="79" w:name="_Hlk224509038"/>
+      <w:bookmarkEnd w:id="78"/>
       <w:r>
         <w:rPr>
           <w:rFonts w:ascii="Times New Roman" w:hAnsi="Times New Roman" w:cs="Times New Roman"/>
@@ -10003,6 +10436,257 @@
           <w:szCs w:val="28"/>
         </w:rPr>
         <w:t>Flujograma de funcionamiento</w:t>
+      </w:r>
+    </w:p>
+    <w:p>
+      <w:pPr>
+        <w:pStyle w:val="Prrafodelista"/>
+        <w:spacing w:after="0" w:line="276" w:lineRule="auto"/>
+        <w:ind w:left="1440"/>
+        <w:jc w:val="both"/>
+        <w:rPr>
+          <w:rFonts w:ascii="Times New Roman" w:hAnsi="Times New Roman" w:cs="Times New Roman"/>
+        </w:rPr>
+      </w:pPr>
+      <w:bookmarkStart w:id="80" w:name="_Hlk224509046"/>
+      <w:bookmarkEnd w:id="79"/>
+      <w:r>
+        <w:rPr>
+          <w:rFonts w:ascii="Times New Roman" w:hAnsi="Times New Roman" w:cs="Times New Roman"/>
+        </w:rPr>
+        <w:t>A continuación, se presenta el flujograma del proceso de uso del aplicativo, el cual describe las principales etapas que siguen los usuarios dentro del sistema para el registro y análisis de los trabajos de investigación.</w:t>
+      </w:r>
+    </w:p>
+    <w:p>
+      <w:pPr>
+        <w:pStyle w:val="Prrafodelista"/>
+        <w:spacing w:after="0" w:line="276" w:lineRule="auto"/>
+        <w:ind w:left="1440"/>
+        <w:jc w:val="both"/>
+        <w:rPr>
+          <w:rFonts w:ascii="Times New Roman" w:hAnsi="Times New Roman" w:cs="Times New Roman"/>
+        </w:rPr>
+      </w:pPr>
+    </w:p>
+    <w:p>
+      <w:pPr>
+        <w:pStyle w:val="Prrafodelista"/>
+        <w:spacing w:after="0" w:line="276" w:lineRule="auto"/>
+        <w:ind w:left="1440"/>
+        <w:jc w:val="both"/>
+        <w:rPr>
+          <w:rFonts w:ascii="Times New Roman" w:hAnsi="Times New Roman" w:cs="Times New Roman"/>
+        </w:rPr>
+      </w:pPr>
+      <w:r>
+        <w:rPr>
+          <w:rFonts w:ascii="Times New Roman" w:hAnsi="Times New Roman" w:cs="Times New Roman"/>
+        </w:rPr>
+        <w:t>El proceso inicia cuando el estudiante registra su proyecto de investigación</w:t>
+      </w:r>
+      <w:r>
+        <w:rPr>
+          <w:rFonts w:ascii="Times New Roman" w:hAnsi="Times New Roman" w:cs="Times New Roman"/>
+        </w:rPr>
+        <w:t xml:space="preserve"> </w:t>
+      </w:r>
+      <w:r>
+        <w:rPr>
+          <w:rFonts w:ascii="Times New Roman" w:hAnsi="Times New Roman" w:cs="Times New Roman"/>
+        </w:rPr>
+        <w:t>dentro de la plataforma. Posteriormente, el sistema le brinda la opción de agregar a un compañero de investigación, permitiendo que el proyecto pueda ser desarrollado de manera conjunta por más de un tesista.</w:t>
+      </w:r>
+    </w:p>
+    <w:p>
+      <w:pPr>
+        <w:pStyle w:val="Prrafodelista"/>
+        <w:spacing w:after="0" w:line="276" w:lineRule="auto"/>
+        <w:ind w:left="1440"/>
+        <w:jc w:val="both"/>
+        <w:rPr>
+          <w:rFonts w:ascii="Times New Roman" w:hAnsi="Times New Roman" w:cs="Times New Roman"/>
+        </w:rPr>
+      </w:pPr>
+    </w:p>
+    <w:p>
+      <w:pPr>
+        <w:pStyle w:val="Prrafodelista"/>
+        <w:spacing w:after="0" w:line="276" w:lineRule="auto"/>
+        <w:ind w:left="1440"/>
+        <w:jc w:val="both"/>
+        <w:rPr>
+          <w:rFonts w:ascii="Times New Roman" w:hAnsi="Times New Roman" w:cs="Times New Roman"/>
+        </w:rPr>
+      </w:pPr>
+      <w:r>
+        <w:rPr>
+          <w:rFonts w:ascii="Times New Roman" w:hAnsi="Times New Roman" w:cs="Times New Roman"/>
+        </w:rPr>
+        <w:t>Una vez que los investigadores han sido asignados al proyecto, el siguiente paso consiste en seleccionar a un docente asesor, quien será responsable de supervisar el trabajo de investigación. Al realizar esta asignación, el sistema envía automáticamente una solicitud de aprobación al docente seleccionado.</w:t>
+      </w:r>
+    </w:p>
+    <w:p>
+      <w:pPr>
+        <w:pStyle w:val="Prrafodelista"/>
+        <w:spacing w:after="0" w:line="276" w:lineRule="auto"/>
+        <w:ind w:left="1440"/>
+        <w:jc w:val="both"/>
+        <w:rPr>
+          <w:rFonts w:ascii="Times New Roman" w:hAnsi="Times New Roman" w:cs="Times New Roman"/>
+        </w:rPr>
+      </w:pPr>
+    </w:p>
+    <w:p>
+      <w:pPr>
+        <w:pStyle w:val="Prrafodelista"/>
+        <w:spacing w:after="0" w:line="276" w:lineRule="auto"/>
+        <w:ind w:left="1440"/>
+        <w:jc w:val="both"/>
+        <w:rPr>
+          <w:rFonts w:ascii="Times New Roman" w:hAnsi="Times New Roman" w:cs="Times New Roman"/>
+        </w:rPr>
+      </w:pPr>
+      <w:r>
+        <w:rPr>
+          <w:rFonts w:ascii="Times New Roman" w:hAnsi="Times New Roman" w:cs="Times New Roman"/>
+        </w:rPr>
+        <w:t>El docente asesor recibe la solicitud y procede a evaluar la asignación del proyecto. En caso de aprobarla, el sistema genera una notificación dirigida tanto a los tesistas como al asesor, informando que el proyecto ha sido aceptado dentro de la plataforma. Posteriormente, se procede a iniciar el proceso de análisis de no duplicidad, el cual tiene como finalidad verificar si el trabajo de investigación presenta similitudes con proyectos previamente registrados.</w:t>
+      </w:r>
+    </w:p>
+    <w:p>
+      <w:pPr>
+        <w:pStyle w:val="Prrafodelista"/>
+        <w:spacing w:after="0" w:line="276" w:lineRule="auto"/>
+        <w:ind w:left="1440"/>
+        <w:jc w:val="both"/>
+        <w:rPr>
+          <w:rFonts w:ascii="Times New Roman" w:hAnsi="Times New Roman" w:cs="Times New Roman"/>
+        </w:rPr>
+      </w:pPr>
+    </w:p>
+    <w:p>
+      <w:pPr>
+        <w:pStyle w:val="Prrafodelista"/>
+        <w:spacing w:after="0" w:line="276" w:lineRule="auto"/>
+        <w:ind w:left="1440"/>
+        <w:jc w:val="both"/>
+        <w:rPr>
+          <w:rFonts w:ascii="Times New Roman" w:hAnsi="Times New Roman" w:cs="Times New Roman"/>
+        </w:rPr>
+      </w:pPr>
+      <w:r>
+        <w:rPr>
+          <w:rFonts w:ascii="Times New Roman" w:hAnsi="Times New Roman" w:cs="Times New Roman"/>
+        </w:rPr>
+        <w:t xml:space="preserve">Una vez finalizado el proceso de análisis, el sistema notifica a los usuarios involucrados sobre la culminación del proceso. En caso de obtener un resultado positivo, es decir, que no se detecten duplicidades significativas con otros trabajos registrados, el sistema genera y envía una constancia firmada </w:t>
+      </w:r>
+      <w:r>
+        <w:rPr>
+          <w:rFonts w:ascii="Times New Roman" w:hAnsi="Times New Roman" w:cs="Times New Roman"/>
+        </w:rPr>
+        <w:lastRenderedPageBreak/>
+        <w:t>digitalmente, la cual certifica la culminación satisfactoria del proceso de verificación.</w:t>
+      </w:r>
+    </w:p>
+    <w:p>
+      <w:pPr>
+        <w:pStyle w:val="Prrafodelista"/>
+        <w:spacing w:after="0" w:line="276" w:lineRule="auto"/>
+        <w:ind w:left="1440"/>
+        <w:jc w:val="both"/>
+        <w:rPr>
+          <w:rFonts w:ascii="Times New Roman" w:hAnsi="Times New Roman" w:cs="Times New Roman"/>
+        </w:rPr>
+      </w:pPr>
+    </w:p>
+    <w:p>
+      <w:pPr>
+        <w:pStyle w:val="Prrafodelista"/>
+        <w:spacing w:after="0" w:line="276" w:lineRule="auto"/>
+        <w:ind w:left="1440"/>
+        <w:jc w:val="both"/>
+        <w:rPr>
+          <w:rFonts w:ascii="Times New Roman" w:hAnsi="Times New Roman" w:cs="Times New Roman"/>
+        </w:rPr>
+      </w:pPr>
+      <w:r>
+        <w:rPr>
+          <w:rFonts w:ascii="Times New Roman" w:hAnsi="Times New Roman" w:cs="Times New Roman"/>
+        </w:rPr>
+        <w:t>Por el contrario, si el resultado del análisis es negativo, indicando la existencia de similitudes relevantes con otros trabajos de investigación, el sistema notifica a los involucrados sobre dicho resultado para que se puedan tomar las acciones correspondientes.</w:t>
+      </w:r>
+    </w:p>
+    <w:p>
+      <w:pPr>
+        <w:pStyle w:val="Prrafodelista"/>
+        <w:spacing w:after="0" w:line="276" w:lineRule="auto"/>
+        <w:ind w:left="1440"/>
+        <w:jc w:val="both"/>
+        <w:rPr>
+          <w:rFonts w:ascii="Times New Roman" w:hAnsi="Times New Roman" w:cs="Times New Roman"/>
+          <w:b/>
+          <w:bCs/>
+          <w:sz w:val="28"/>
+          <w:szCs w:val="28"/>
+        </w:rPr>
+      </w:pPr>
+      <w:r>
+        <w:rPr>
+          <w:rFonts w:ascii="Times New Roman" w:hAnsi="Times New Roman" w:cs="Times New Roman"/>
+          <w:b/>
+          <w:bCs/>
+          <w:noProof/>
+          <w:sz w:val="28"/>
+          <w:szCs w:val="28"/>
+        </w:rPr>
+        <w:drawing>
+          <wp:inline distT="0" distB="0" distL="0" distR="0" wp14:anchorId="3E74FFDF" wp14:editId="7A8313AE">
+            <wp:extent cx="4711959" cy="4531612"/>
+            <wp:effectExtent l="0" t="0" r="0" b="2540"/>
+            <wp:docPr id="1133284470" name="Imagen 5"/>
+            <wp:cNvGraphicFramePr>
+              <a:graphicFrameLocks xmlns:a="http://schemas.openxmlformats.org/drawingml/2006/main" noChangeAspect="1"/>
+            </wp:cNvGraphicFramePr>
+            <a:graphic xmlns:a="http://schemas.openxmlformats.org/drawingml/2006/main">
+              <a:graphicData uri="http://schemas.openxmlformats.org/drawingml/2006/picture">
+                <pic:pic xmlns:pic="http://schemas.openxmlformats.org/drawingml/2006/picture">
+                  <pic:nvPicPr>
+                    <pic:cNvPr id="0" name="Picture 3"/>
+                    <pic:cNvPicPr>
+                      <a:picLocks noChangeAspect="1" noChangeArrowheads="1"/>
+                    </pic:cNvPicPr>
+                  </pic:nvPicPr>
+                  <pic:blipFill>
+                    <a:blip r:embed="rId14" cstate="print">
+                      <a:extLst>
+                        <a:ext uri="{28A0092B-C50C-407E-A947-70E740481C1C}">
+                          <a14:useLocalDpi xmlns:a14="http://schemas.microsoft.com/office/drawing/2010/main" val="0"/>
+                        </a:ext>
+                      </a:extLst>
+                    </a:blip>
+                    <a:srcRect/>
+                    <a:stretch>
+                      <a:fillRect/>
+                    </a:stretch>
+                  </pic:blipFill>
+                  <pic:spPr bwMode="auto">
+                    <a:xfrm>
+                      <a:off x="0" y="0"/>
+                      <a:ext cx="4717520" cy="4536960"/>
+                    </a:xfrm>
+                    <a:prstGeom prst="rect">
+                      <a:avLst/>
+                    </a:prstGeom>
+                    <a:noFill/>
+                    <a:ln>
+                      <a:noFill/>
+                    </a:ln>
+                  </pic:spPr>
+                </pic:pic>
+              </a:graphicData>
+            </a:graphic>
+          </wp:inline>
+        </w:drawing>
       </w:r>
     </w:p>
     <w:p>
@@ -10013,11 +10697,12 @@
           <w:numId w:val="9"/>
         </w:numPr>
       </w:pPr>
-      <w:bookmarkStart w:id="29" w:name="_Toc224059876"/>
+      <w:bookmarkStart w:id="81" w:name="_Toc224059876"/>
+      <w:bookmarkEnd w:id="80"/>
       <w:r>
         <w:t>Enfoque de la investigación</w:t>
       </w:r>
-      <w:bookmarkEnd w:id="29"/>
+      <w:bookmarkEnd w:id="81"/>
     </w:p>
     <w:p>
       <w:pPr>
@@ -10028,6 +10713,7 @@
           <w:rFonts w:ascii="Times New Roman" w:hAnsi="Times New Roman" w:cs="Times New Roman"/>
         </w:rPr>
       </w:pPr>
+      <w:bookmarkStart w:id="82" w:name="_Hlk224509310"/>
       <w:r>
         <w:rPr>
           <w:rFonts w:ascii="Times New Roman" w:hAnsi="Times New Roman" w:cs="Times New Roman"/>
@@ -10048,6 +10734,7 @@
         <w:rPr>
           <w:rFonts w:ascii="Times New Roman" w:hAnsi="Times New Roman" w:cs="Times New Roman"/>
         </w:rPr>
+        <w:lastRenderedPageBreak/>
         <w:t>El enfoque cuantitativo permite realizar comparaciones entre los resultados obtenidos antes y después de la implementación del sistema, proporcionando evidencia objetiva que sustenta la efectividad de la solución propuesta.</w:t>
       </w:r>
     </w:p>
@@ -10055,11 +10742,12 @@
       <w:pPr>
         <w:pStyle w:val="Ttulo2"/>
       </w:pPr>
-      <w:bookmarkStart w:id="30" w:name="_Toc224059877"/>
+      <w:bookmarkStart w:id="83" w:name="_Toc224059877"/>
+      <w:bookmarkEnd w:id="82"/>
       <w:r>
         <w:t>Nivel de investigación</w:t>
       </w:r>
-      <w:bookmarkEnd w:id="30"/>
+      <w:bookmarkEnd w:id="83"/>
     </w:p>
     <w:p>
       <w:pPr>
@@ -10070,6 +10758,7 @@
           <w:rFonts w:ascii="Times New Roman" w:hAnsi="Times New Roman" w:cs="Times New Roman"/>
         </w:rPr>
       </w:pPr>
+      <w:bookmarkStart w:id="84" w:name="_Hlk224509397"/>
       <w:r>
         <w:rPr>
           <w:rFonts w:ascii="Times New Roman" w:hAnsi="Times New Roman" w:cs="Times New Roman"/>
@@ -10099,6 +10788,7 @@
         <w:t xml:space="preserve"> </w:t>
       </w:r>
     </w:p>
+    <w:bookmarkEnd w:id="84"/>
     <w:p>
       <w:pPr>
         <w:pStyle w:val="Prrafodelista"/>
@@ -10120,7 +10810,7 @@
           <w:rFonts w:ascii="Times New Roman" w:hAnsi="Times New Roman" w:cs="Times New Roman"/>
         </w:rPr>
         <w:sectPr>
-          <w:footerReference w:type="default" r:id="rId14"/>
+          <w:footerReference w:type="default" r:id="rId15"/>
           <w:pgSz w:w="12240" w:h="15840"/>
           <w:pgMar w:top="1418" w:right="1701" w:bottom="1418" w:left="1701" w:header="720" w:footer="720" w:gutter="0"/>
           <w:cols w:space="720"/>
@@ -10136,12 +10826,12 @@
           <w:numId w:val="8"/>
         </w:numPr>
       </w:pPr>
-      <w:bookmarkStart w:id="31" w:name="_Toc224059878"/>
+      <w:bookmarkStart w:id="85" w:name="_Toc224059878"/>
       <w:r>
         <w:lastRenderedPageBreak/>
         <w:t>Tabla de operacionalización de variable</w:t>
       </w:r>
-      <w:bookmarkEnd w:id="31"/>
+      <w:bookmarkEnd w:id="85"/>
     </w:p>
     <w:tbl>
       <w:tblPr>
@@ -10186,6 +10876,7 @@
                 <w:sz w:val="20"/>
               </w:rPr>
             </w:pPr>
+            <w:bookmarkStart w:id="86" w:name="_Hlk224509585"/>
           </w:p>
           <w:p>
             <w:pPr>
@@ -12145,6 +12836,7 @@
           </w:p>
         </w:tc>
       </w:tr>
+      <w:bookmarkEnd w:id="86"/>
     </w:tbl>
     <w:p/>
     <w:p/>
@@ -14035,10 +14727,12 @@
     </w:tbl>
     <w:p>
       <w:pPr>
-        <w:rPr>
-          <w:rFonts w:ascii="Times New Roman" w:hAnsi="Times New Roman" w:cs="Times New Roman"/>
-        </w:rPr>
-      </w:pPr>
+        <w:ind w:firstLine="360"/>
+        <w:rPr>
+          <w:rFonts w:ascii="Times New Roman" w:hAnsi="Times New Roman" w:cs="Times New Roman"/>
+        </w:rPr>
+      </w:pPr>
+      <w:bookmarkStart w:id="87" w:name="_Hlk224509767"/>
       <w:r>
         <w:rPr>
           <w:rFonts w:ascii="Times New Roman" w:hAnsi="Times New Roman" w:cs="Times New Roman"/>
@@ -14046,6 +14740,7 @@
         <w:t>Elaboración propia</w:t>
       </w:r>
     </w:p>
+    <w:bookmarkEnd w:id="87"/>
     <w:p>
       <w:pPr>
         <w:spacing w:line="480" w:lineRule="auto"/>
@@ -14068,12 +14763,12 @@
           <w:numId w:val="8"/>
         </w:numPr>
       </w:pPr>
-      <w:bookmarkStart w:id="32" w:name="_Toc224059879"/>
+      <w:bookmarkStart w:id="88" w:name="_Toc224059879"/>
       <w:r>
         <w:lastRenderedPageBreak/>
         <w:t>Población y muestra</w:t>
       </w:r>
-      <w:bookmarkEnd w:id="32"/>
+      <w:bookmarkEnd w:id="88"/>
     </w:p>
     <w:p>
       <w:pPr>
@@ -14096,6 +14791,7 @@
           <w:iCs/>
         </w:rPr>
       </w:pPr>
+      <w:bookmarkStart w:id="89" w:name="_Hlk224509791"/>
       <w:r>
         <w:rPr>
           <w:rFonts w:ascii="Times New Roman" w:hAnsi="Times New Roman" w:cs="Times New Roman"/>
@@ -14188,11 +14884,12 @@
           <w:numId w:val="8"/>
         </w:numPr>
       </w:pPr>
-      <w:bookmarkStart w:id="33" w:name="_Toc224059880"/>
+      <w:bookmarkStart w:id="90" w:name="_Toc224059880"/>
+      <w:bookmarkEnd w:id="89"/>
       <w:r>
         <w:t>Técnicas, instrumentos, equipos y materiales</w:t>
       </w:r>
-      <w:bookmarkEnd w:id="33"/>
+      <w:bookmarkEnd w:id="90"/>
     </w:p>
     <w:p>
       <w:pPr>
@@ -14206,6 +14903,7 @@
           <w:rFonts w:ascii="Times New Roman" w:hAnsi="Times New Roman" w:cs="Times New Roman"/>
         </w:rPr>
       </w:pPr>
+      <w:bookmarkStart w:id="91" w:name="_Hlk224509886"/>
       <w:r>
         <w:rPr>
           <w:rFonts w:ascii="Times New Roman" w:hAnsi="Times New Roman" w:cs="Times New Roman"/>
@@ -14357,6 +15055,7 @@
         <w:t xml:space="preserve"> Se realizarán encuestas para medir el tiempo de atención, calidad de atención y calidad de resultados, con estos resultados, podremos tomar como referencia un punto de partida, para mejorar los indicadores. </w:t>
       </w:r>
     </w:p>
+    <w:bookmarkEnd w:id="91"/>
     <w:p>
       <w:pPr>
         <w:spacing w:line="480" w:lineRule="auto"/>
@@ -14388,7 +15087,7 @@
           <w:rFonts w:cs="Times New Roman"/>
         </w:rPr>
       </w:pPr>
-      <w:bookmarkStart w:id="34" w:name="_Toc224059881"/>
+      <w:bookmarkStart w:id="92" w:name="_Toc224059881"/>
       <w:r>
         <w:rPr>
           <w:rFonts w:cs="Times New Roman"/>
@@ -14396,7 +15095,7 @@
         <w:lastRenderedPageBreak/>
         <w:t>Actividades y recursos</w:t>
       </w:r>
-      <w:bookmarkEnd w:id="34"/>
+      <w:bookmarkEnd w:id="92"/>
       <w:r>
         <w:rPr>
           <w:rFonts w:cs="Times New Roman"/>
@@ -14412,11 +15111,11 @@
           <w:numId w:val="8"/>
         </w:numPr>
       </w:pPr>
-      <w:bookmarkStart w:id="35" w:name="_Toc224059882"/>
+      <w:bookmarkStart w:id="93" w:name="_Toc224059882"/>
       <w:r>
         <w:t>Cronograma</w:t>
       </w:r>
-      <w:bookmarkEnd w:id="35"/>
+      <w:bookmarkEnd w:id="93"/>
     </w:p>
     <w:p>
       <w:pPr>
@@ -14425,6 +15124,7 @@
           <w:rFonts w:ascii="Times New Roman" w:hAnsi="Times New Roman" w:cs="Times New Roman"/>
         </w:rPr>
       </w:pPr>
+      <w:bookmarkStart w:id="94" w:name="_Hlk224510024"/>
       <w:r>
         <w:rPr>
           <w:rFonts w:ascii="Times New Roman" w:hAnsi="Times New Roman" w:cs="Times New Roman"/>
@@ -14446,7 +15146,7 @@
                     <pic:cNvPicPr/>
                   </pic:nvPicPr>
                   <pic:blipFill>
-                    <a:blip r:embed="rId15"/>
+                    <a:blip r:embed="rId16"/>
                     <a:stretch>
                       <a:fillRect/>
                     </a:stretch>
@@ -14502,10 +15202,10 @@
             <v:path o:extrusionok="f" gradientshapeok="t" o:connecttype="rect"/>
             <o:lock v:ext="edit" aspectratio="t"/>
           </v:shapetype>
-          <v:shape id="_x0000_i1025" type="#_x0000_t75" style="width:77.15pt;height:49.95pt" o:ole="">
-            <v:imagedata r:id="rId16" o:title=""/>
+          <v:shape id="_x0000_i1025" type="#_x0000_t75" style="width:76.7pt;height:49.55pt" o:ole="">
+            <v:imagedata r:id="rId17" o:title=""/>
           </v:shape>
-          <o:OLEObject Type="Embed" ProgID="Package" ShapeID="_x0000_i1025" DrawAspect="Icon" ObjectID="_1834866819" r:id="rId17"/>
+          <o:OLEObject Type="Embed" ProgID="Package" ShapeID="_x0000_i1025" DrawAspect="Icon" ObjectID="_1835123464" r:id="rId18"/>
         </w:object>
       </w:r>
     </w:p>
@@ -14516,6 +15216,8 @@
           <w:rFonts w:ascii="Times New Roman" w:hAnsi="Times New Roman" w:cs="Times New Roman"/>
         </w:rPr>
       </w:pPr>
+      <w:bookmarkStart w:id="95" w:name="_Hlk224510073"/>
+      <w:bookmarkEnd w:id="94"/>
       <w:r>
         <w:rPr>
           <w:rFonts w:ascii="Times New Roman" w:hAnsi="Times New Roman" w:cs="Times New Roman"/>
@@ -14523,6 +15225,7 @@
         <w:t>Fuente: Elaboración propia</w:t>
       </w:r>
     </w:p>
+    <w:bookmarkEnd w:id="95"/>
     <w:p>
       <w:pPr>
         <w:spacing w:line="480" w:lineRule="auto"/>
@@ -14551,12 +15254,13 @@
           <w:numId w:val="8"/>
         </w:numPr>
       </w:pPr>
-      <w:bookmarkStart w:id="36" w:name="_Toc224059883"/>
+      <w:bookmarkStart w:id="96" w:name="_Toc224059883"/>
+      <w:bookmarkStart w:id="97" w:name="_Hlk224510104"/>
       <w:r>
         <w:lastRenderedPageBreak/>
         <w:t>Presupuesto</w:t>
       </w:r>
-      <w:bookmarkEnd w:id="36"/>
+      <w:bookmarkEnd w:id="96"/>
     </w:p>
     <w:tbl>
       <w:tblPr>
@@ -14600,6 +15304,7 @@
                 <w:rFonts w:ascii="Times New Roman" w:hAnsi="Times New Roman" w:cs="Times New Roman"/>
               </w:rPr>
             </w:pPr>
+            <w:bookmarkStart w:id="98" w:name="_Hlk224510115"/>
             <w:r>
               <w:rPr>
                 <w:rFonts w:ascii="Times New Roman" w:hAnsi="Times New Roman" w:cs="Times New Roman"/>
@@ -15318,6 +16023,8 @@
           <w:rFonts w:ascii="Times New Roman" w:hAnsi="Times New Roman" w:cs="Times New Roman"/>
         </w:rPr>
       </w:pPr>
+      <w:bookmarkStart w:id="99" w:name="_Hlk224510140"/>
+      <w:bookmarkEnd w:id="98"/>
       <w:r>
         <w:rPr>
           <w:rFonts w:ascii="Times New Roman" w:hAnsi="Times New Roman" w:cs="Times New Roman"/>
@@ -15340,13 +16047,15 @@
           <w:rFonts w:ascii="Times New Roman" w:hAnsi="Times New Roman" w:cs="Times New Roman"/>
         </w:rPr>
         <w:object w:dxaOrig="1541" w:dyaOrig="998" w14:anchorId="41D0C79D">
-          <v:shape id="_x0000_i1026" type="#_x0000_t75" style="width:77.15pt;height:49.95pt" o:ole="">
-            <v:imagedata r:id="rId18" o:title=""/>
+          <v:shape id="_x0000_i1026" type="#_x0000_t75" style="width:76.7pt;height:49.55pt" o:ole="">
+            <v:imagedata r:id="rId19" o:title=""/>
           </v:shape>
-          <o:OLEObject Type="Embed" ProgID="Excel.Sheet.12" ShapeID="_x0000_i1026" DrawAspect="Icon" ObjectID="_1834866820" r:id="rId19"/>
+          <o:OLEObject Type="Embed" ProgID="Excel.Sheet.12" ShapeID="_x0000_i1026" DrawAspect="Icon" ObjectID="_1835123465" r:id="rId20"/>
         </w:object>
       </w:r>
     </w:p>
+    <w:bookmarkEnd w:id="97"/>
+    <w:bookmarkEnd w:id="99"/>
     <w:p>
       <w:pPr>
         <w:tabs>
@@ -15373,12 +16082,12 @@
           <w:numId w:val="8"/>
         </w:numPr>
       </w:pPr>
-      <w:bookmarkStart w:id="37" w:name="_Toc224059884"/>
+      <w:bookmarkStart w:id="100" w:name="_Toc224059884"/>
       <w:r>
         <w:lastRenderedPageBreak/>
         <w:t>Financiamiento</w:t>
       </w:r>
-      <w:bookmarkEnd w:id="37"/>
+      <w:bookmarkEnd w:id="100"/>
       <w:r>
         <w:t xml:space="preserve"> </w:t>
       </w:r>
@@ -15394,6 +16103,7 @@
           <w:rFonts w:ascii="Times New Roman" w:hAnsi="Times New Roman" w:cs="Times New Roman"/>
         </w:rPr>
       </w:pPr>
+      <w:bookmarkStart w:id="101" w:name="_Hlk224510168"/>
       <w:r>
         <w:rPr>
           <w:rFonts w:ascii="Times New Roman" w:hAnsi="Times New Roman" w:cs="Times New Roman"/>
@@ -15421,11 +16131,12 @@
           <w:numId w:val="8"/>
         </w:numPr>
       </w:pPr>
-      <w:bookmarkStart w:id="38" w:name="_Toc224059885"/>
+      <w:bookmarkStart w:id="102" w:name="_Toc224059885"/>
+      <w:bookmarkEnd w:id="101"/>
       <w:r>
         <w:t>Productos y difusión de resultados</w:t>
       </w:r>
-      <w:bookmarkEnd w:id="38"/>
+      <w:bookmarkEnd w:id="102"/>
     </w:p>
     <w:p>
       <w:pPr>
@@ -15439,12 +16150,14 @@
           <w:rFonts w:ascii="Times New Roman" w:hAnsi="Times New Roman" w:cs="Times New Roman"/>
         </w:rPr>
       </w:pPr>
+      <w:bookmarkStart w:id="103" w:name="_Hlk224510192"/>
       <w:r>
         <w:rPr>
           <w:rFonts w:ascii="Times New Roman" w:hAnsi="Times New Roman" w:cs="Times New Roman"/>
         </w:rPr>
         <w:t>Se presentará el informe final y el artículo científico a la editorial de la UNPRG.</w:t>
       </w:r>
+      <w:bookmarkEnd w:id="103"/>
     </w:p>
     <w:sectPr>
       <w:pgSz w:w="12240" w:h="15840"/>

</xml_diff>